<commit_message>
update final manuscript files
</commit_message>
<xml_diff>
--- a/CJFAS-Submission/CJFAS-final/cjfas-2026-0089manuscript.docx
+++ b/CJFAS-Submission/CJFAS-final/cjfas-2026-0089manuscript.docx
@@ -325,15 +325,12 @@
       <w:r>
         <w:t>*Corresponding author: Robert T. Ames (</w:t>
       </w:r>
-      <w:hyperlink r:id="rId6">
-        <w:r>
-          <w:rPr>
-            <w:color w:val="1155CC"/>
-            <w:u w:val="single"/>
-          </w:rPr>
-          <w:t>RAmes@psmfc.org</w:t>
-        </w:r>
-      </w:hyperlink>
+      <w:r>
+        <w:rPr>
+          <w:u w:val="single"/>
+        </w:rPr>
+        <w:t>RAmes@psmfc.org</w:t>
+      </w:r>
       <w:r>
         <w:t>)</w:t>
       </w:r>
@@ -409,14 +406,7 @@
           <w:rFonts w:eastAsia="Arial"/>
           <w:lang w:val="en-US"/>
         </w:rPr>
-        <w:t>Robert T. Ames:</w:t>
-      </w:r>
-      <w:r>
-        <w:rPr>
-          <w:rFonts w:eastAsia="Arial"/>
-          <w:lang w:val="en-US"/>
-        </w:rPr>
-        <w:t xml:space="preserve"> </w:t>
+        <w:t xml:space="preserve">Robert T. Ames: </w:t>
       </w:r>
       <w:r>
         <w:rPr>
@@ -442,13 +432,27 @@
         <w:spacing w:after="0" w:line="480" w:lineRule="auto"/>
         <w:jc w:val="left"/>
         <w:rPr>
-          <w:rFonts w:ascii="Arial" w:eastAsia="Arial" w:hAnsi="Arial" w:cs="Arial"/>
-          <w:b/>
-          <w:bCs/>
-          <w:sz w:val="24"/>
-          <w:szCs w:val="24"/>
-        </w:rPr>
-      </w:pPr>
+          <w:rFonts w:eastAsia="Arial"/>
+          <w:lang w:val="en-US"/>
+        </w:rPr>
+      </w:pPr>
+      <w:r>
+        <w:t>Patrick D. Barry</w:t>
+      </w:r>
+      <w:r>
+        <w:rPr>
+          <w:rFonts w:eastAsia="Arial"/>
+          <w:lang w:val="en-US"/>
+        </w:rPr>
+        <w:t xml:space="preserve">: </w:t>
+      </w:r>
+      <w:r>
+        <w:rPr>
+          <w:rFonts w:eastAsia="Arial"/>
+          <w:lang w:val="en-US"/>
+        </w:rPr>
+        <w:t>https://orcid.org/0009-0000-4190-8507</w:t>
+      </w:r>
     </w:p>
     <w:p>
       <w:pPr>
@@ -466,13 +470,23 @@
         <w:spacing w:after="0" w:line="480" w:lineRule="auto"/>
         <w:jc w:val="left"/>
         <w:rPr>
-          <w:rFonts w:ascii="Arial" w:eastAsia="Arial" w:hAnsi="Arial" w:cs="Arial"/>
-          <w:b/>
-          <w:bCs/>
-          <w:sz w:val="24"/>
-          <w:szCs w:val="24"/>
-        </w:rPr>
-      </w:pPr>
+          <w:rFonts w:eastAsia="Arial"/>
+          <w:lang w:val="en-US"/>
+        </w:rPr>
+      </w:pPr>
+      <w:r>
+        <w:t>Jodi C. Neil</w:t>
+      </w:r>
+      <w:r>
+        <w:t xml:space="preserve">: </w:t>
+      </w:r>
+      <w:r>
+        <w:rPr>
+          <w:rFonts w:eastAsia="Arial"/>
+          <w:lang w:val="en-US"/>
+        </w:rPr>
+        <w:t>https://orcid.org/0000-0001-8438-0124</w:t>
+      </w:r>
     </w:p>
     <w:p>
       <w:pPr>
@@ -490,6 +504,138 @@
         <w:spacing w:after="0" w:line="480" w:lineRule="auto"/>
         <w:jc w:val="left"/>
         <w:rPr>
+          <w:rFonts w:eastAsia="Arial"/>
+          <w:lang w:val="en-US"/>
+        </w:rPr>
+      </w:pPr>
+      <w:r>
+        <w:rPr>
+          <w:rFonts w:eastAsia="Arial"/>
+          <w:lang w:val="en-US"/>
+        </w:rPr>
+        <w:t>Jordan T. Watson</w:t>
+      </w:r>
+      <w:r>
+        <w:rPr>
+          <w:rFonts w:eastAsia="Arial"/>
+          <w:lang w:val="en-US"/>
+        </w:rPr>
+        <w:t xml:space="preserve">: </w:t>
+      </w:r>
+      <w:r>
+        <w:rPr>
+          <w:rFonts w:eastAsia="Arial"/>
+          <w:lang w:val="en-US"/>
+        </w:rPr>
+        <w:t>https://orcid.org/0000-0002-1686-0377</w:t>
+      </w:r>
+    </w:p>
+    <w:p>
+      <w:pPr>
+        <w:pBdr>
+          <w:top w:val="nil"/>
+          <w:left w:val="nil"/>
+          <w:bottom w:val="nil"/>
+          <w:right w:val="nil"/>
+          <w:between w:val="nil"/>
+        </w:pBdr>
+        <w:tabs>
+          <w:tab w:val="center" w:pos="4680"/>
+          <w:tab w:val="right" w:pos="9360"/>
+        </w:tabs>
+        <w:spacing w:after="0" w:line="480" w:lineRule="auto"/>
+        <w:jc w:val="left"/>
+        <w:rPr>
+          <w:rFonts w:eastAsia="Arial"/>
+          <w:lang w:val="en-US"/>
+        </w:rPr>
+      </w:pPr>
+    </w:p>
+    <w:p>
+      <w:pPr>
+        <w:pBdr>
+          <w:top w:val="nil"/>
+          <w:left w:val="nil"/>
+          <w:bottom w:val="nil"/>
+          <w:right w:val="nil"/>
+          <w:between w:val="nil"/>
+        </w:pBdr>
+        <w:tabs>
+          <w:tab w:val="center" w:pos="4680"/>
+          <w:tab w:val="right" w:pos="9360"/>
+        </w:tabs>
+        <w:spacing w:after="0" w:line="480" w:lineRule="auto"/>
+        <w:jc w:val="left"/>
+        <w:rPr>
+          <w:rFonts w:eastAsia="Arial"/>
+          <w:lang w:val="en-US"/>
+        </w:rPr>
+      </w:pPr>
+    </w:p>
+    <w:p>
+      <w:pPr>
+        <w:pBdr>
+          <w:top w:val="nil"/>
+          <w:left w:val="nil"/>
+          <w:bottom w:val="nil"/>
+          <w:right w:val="nil"/>
+          <w:between w:val="nil"/>
+        </w:pBdr>
+        <w:tabs>
+          <w:tab w:val="center" w:pos="4680"/>
+          <w:tab w:val="right" w:pos="9360"/>
+        </w:tabs>
+        <w:spacing w:after="0" w:line="480" w:lineRule="auto"/>
+        <w:jc w:val="left"/>
+        <w:rPr>
+          <w:rFonts w:ascii="Arial" w:eastAsia="Arial" w:hAnsi="Arial" w:cs="Arial"/>
+          <w:b/>
+          <w:bCs/>
+          <w:sz w:val="24"/>
+          <w:szCs w:val="24"/>
+        </w:rPr>
+      </w:pPr>
+    </w:p>
+    <w:p>
+      <w:pPr>
+        <w:pBdr>
+          <w:top w:val="nil"/>
+          <w:left w:val="nil"/>
+          <w:bottom w:val="nil"/>
+          <w:right w:val="nil"/>
+          <w:between w:val="nil"/>
+        </w:pBdr>
+        <w:tabs>
+          <w:tab w:val="center" w:pos="4680"/>
+          <w:tab w:val="right" w:pos="9360"/>
+        </w:tabs>
+        <w:spacing w:after="0" w:line="480" w:lineRule="auto"/>
+        <w:jc w:val="left"/>
+        <w:rPr>
+          <w:rFonts w:ascii="Arial" w:eastAsia="Arial" w:hAnsi="Arial" w:cs="Arial"/>
+          <w:b/>
+          <w:bCs/>
+          <w:sz w:val="24"/>
+          <w:szCs w:val="24"/>
+        </w:rPr>
+      </w:pPr>
+    </w:p>
+    <w:p>
+      <w:pPr>
+        <w:pBdr>
+          <w:top w:val="nil"/>
+          <w:left w:val="nil"/>
+          <w:bottom w:val="nil"/>
+          <w:right w:val="nil"/>
+          <w:between w:val="nil"/>
+        </w:pBdr>
+        <w:tabs>
+          <w:tab w:val="center" w:pos="4680"/>
+          <w:tab w:val="right" w:pos="9360"/>
+        </w:tabs>
+        <w:spacing w:after="0" w:line="480" w:lineRule="auto"/>
+        <w:jc w:val="left"/>
+        <w:rPr>
           <w:rFonts w:ascii="Arial" w:eastAsia="Arial" w:hAnsi="Arial" w:cs="Arial"/>
           <w:b/>
           <w:bCs/>
@@ -529,7 +675,6 @@
           <w:sz w:val="24"/>
           <w:szCs w:val="24"/>
         </w:rPr>
-        <w:lastRenderedPageBreak/>
         <w:t>Abstract</w:t>
       </w:r>
     </w:p>
@@ -741,7 +886,6 @@
           <w:sz w:val="24"/>
           <w:szCs w:val="24"/>
         </w:rPr>
-        <w:lastRenderedPageBreak/>
         <w:t xml:space="preserve">Estimates of fish age are often critical data for stock assessments and hence central to sustainable fisheries management. Traditionally, ages have been estimated by manually evaluating the seasonal periodicity of growth as </w:t>
       </w:r>
       <w:r>
@@ -823,7 +967,16 @@
           <w:szCs w:val="24"/>
           <w:highlight w:val="white"/>
         </w:rPr>
-        <w:t xml:space="preserve"> individuals.  Commercial, recreational, and subsistence harvest of salmon throughout the Pacific Northwest and Alaska is largely dependent on forecasts created from the previous year’s inferred age composition, stock recruitment relationship, and escapement (i.e., the number of salmon that escape fisheries and return to natal streams to spawn) to set new harvest limits and potentially revise escapement goals. Age estimates from scales are derived from the interpretation of the incremental growth pattern featuring a series of circular and semi-circular ridges (</w:t>
+        <w:t xml:space="preserve"> individuals.  Commercial, recreational, and subsistence harvest of salmon throughout the Pacific Northwest and Alaska is largely dependent on forecasts created from the </w:t>
+      </w:r>
+      <w:r>
+        <w:rPr>
+          <w:sz w:val="24"/>
+          <w:szCs w:val="24"/>
+          <w:highlight w:val="white"/>
+        </w:rPr>
+        <w:lastRenderedPageBreak/>
+        <w:t>previous year’s inferred age composition, stock recruitment relationship, and escapement (i.e., the number of salmon that escape fisheries and return to natal streams to spawn) to set new harvest limits and potentially revise escapement goals. Age estimates from scales are derived from the interpretation of the incremental growth pattern featuring a series of circular and semi-circular ridges (</w:t>
       </w:r>
       <w:proofErr w:type="spellStart"/>
       <w:r>
@@ -877,8 +1030,221 @@
           <w:szCs w:val="24"/>
           <w:highlight w:val="white"/>
         </w:rPr>
-        <w:t xml:space="preserve"> </w:t>
-      </w:r>
+        <w:t xml:space="preserve"> (McNicol and MacLellan 2010). The general pattern for Pacific salmon is rapid growth in the spring and summer producing wide spacing between the </w:t>
+      </w:r>
+      <w:proofErr w:type="spellStart"/>
+      <w:r>
+        <w:rPr>
+          <w:sz w:val="24"/>
+          <w:szCs w:val="24"/>
+          <w:highlight w:val="white"/>
+        </w:rPr>
+        <w:t>circuli</w:t>
+      </w:r>
+      <w:proofErr w:type="spellEnd"/>
+      <w:r>
+        <w:rPr>
+          <w:sz w:val="24"/>
+          <w:szCs w:val="24"/>
+          <w:highlight w:val="white"/>
+        </w:rPr>
+        <w:t xml:space="preserve">, and slow growth in the fall and winter producing narrow </w:t>
+      </w:r>
+      <w:proofErr w:type="spellStart"/>
+      <w:r>
+        <w:rPr>
+          <w:sz w:val="24"/>
+          <w:szCs w:val="24"/>
+          <w:highlight w:val="white"/>
+        </w:rPr>
+        <w:t>circuli</w:t>
+      </w:r>
+      <w:proofErr w:type="spellEnd"/>
+      <w:r>
+        <w:rPr>
+          <w:sz w:val="24"/>
+          <w:szCs w:val="24"/>
+          <w:highlight w:val="white"/>
+        </w:rPr>
+        <w:t xml:space="preserve"> spacing</w:t>
+      </w:r>
+      <w:r>
+        <w:rPr>
+          <w:sz w:val="24"/>
+          <w:szCs w:val="24"/>
+        </w:rPr>
+        <w:t xml:space="preserve"> (Figures S1 and S2; Clutter and Whitesel 1956;</w:t>
+      </w:r>
+      <w:r>
+        <w:rPr>
+          <w:sz w:val="24"/>
+          <w:szCs w:val="24"/>
+          <w:highlight w:val="white"/>
+        </w:rPr>
+        <w:t xml:space="preserve"> Sato et al. 1958; Barber and Walker 1988). Combined, widely spaced </w:t>
+      </w:r>
+      <w:proofErr w:type="spellStart"/>
+      <w:r>
+        <w:rPr>
+          <w:sz w:val="24"/>
+          <w:szCs w:val="24"/>
+          <w:highlight w:val="white"/>
+        </w:rPr>
+        <w:t>circuli</w:t>
+      </w:r>
+      <w:proofErr w:type="spellEnd"/>
+      <w:r>
+        <w:rPr>
+          <w:sz w:val="24"/>
+          <w:szCs w:val="24"/>
+          <w:highlight w:val="white"/>
+        </w:rPr>
+        <w:t xml:space="preserve"> followed by a band of closely spaced </w:t>
+      </w:r>
+      <w:proofErr w:type="spellStart"/>
+      <w:r>
+        <w:rPr>
+          <w:sz w:val="24"/>
+          <w:szCs w:val="24"/>
+          <w:highlight w:val="white"/>
+        </w:rPr>
+        <w:t>circuli</w:t>
+      </w:r>
+      <w:proofErr w:type="spellEnd"/>
+      <w:r>
+        <w:rPr>
+          <w:sz w:val="24"/>
+          <w:szCs w:val="24"/>
+          <w:highlight w:val="white"/>
+        </w:rPr>
+        <w:t xml:space="preserve"> form an annual growth zone or annulus (LaLanne and </w:t>
+      </w:r>
+      <w:proofErr w:type="spellStart"/>
+      <w:r>
+        <w:rPr>
+          <w:sz w:val="24"/>
+          <w:szCs w:val="24"/>
+          <w:highlight w:val="white"/>
+        </w:rPr>
+        <w:t>Safsten</w:t>
+      </w:r>
+      <w:proofErr w:type="spellEnd"/>
+      <w:r>
+        <w:rPr>
+          <w:sz w:val="24"/>
+          <w:szCs w:val="24"/>
+          <w:highlight w:val="white"/>
+        </w:rPr>
+        <w:t xml:space="preserve"> 1969; McNicol and MacLellan 2010). </w:t>
+      </w:r>
+    </w:p>
+    <w:p>
+      <w:pPr>
+        <w:spacing w:before="240" w:after="240" w:line="480" w:lineRule="auto"/>
+        <w:jc w:val="left"/>
+        <w:rPr>
+          <w:sz w:val="24"/>
+          <w:szCs w:val="24"/>
+          <w:highlight w:val="white"/>
+        </w:rPr>
+      </w:pPr>
+      <w:r>
+        <w:rPr>
+          <w:sz w:val="24"/>
+          <w:szCs w:val="24"/>
+          <w:highlight w:val="white"/>
+        </w:rPr>
+        <w:t xml:space="preserve">Most advances in age estimation have focused on sample collection, structure </w:t>
+      </w:r>
+      <w:proofErr w:type="gramStart"/>
+      <w:r>
+        <w:rPr>
+          <w:sz w:val="24"/>
+          <w:szCs w:val="24"/>
+          <w:highlight w:val="white"/>
+        </w:rPr>
+        <w:t>processing,  microscope</w:t>
+      </w:r>
+      <w:proofErr w:type="gramEnd"/>
+      <w:r>
+        <w:rPr>
+          <w:sz w:val="24"/>
+          <w:szCs w:val="24"/>
+          <w:highlight w:val="white"/>
+        </w:rPr>
+        <w:t xml:space="preserve"> equipment, age validation, and imaging; meanwhile, improvements in machine learning, particularly a subset of machine learning called deep learning (DL), have shown strong potential in their application to estimate age of fish populations</w:t>
+      </w:r>
+      <w:r>
+        <w:rPr>
+          <w:sz w:val="24"/>
+          <w:szCs w:val="24"/>
+        </w:rPr>
+        <w:t xml:space="preserve"> (LeCun et al. 2015; </w:t>
+      </w:r>
+      <w:r>
+        <w:rPr>
+          <w:sz w:val="24"/>
+          <w:szCs w:val="24"/>
+          <w:highlight w:val="white"/>
+        </w:rPr>
+        <w:t>Moen et al. 2023; Vabø et al. 2021).</w:t>
+      </w:r>
+      <w:r>
+        <w:rPr>
+          <w:sz w:val="24"/>
+          <w:szCs w:val="24"/>
+        </w:rPr>
+        <w:t xml:space="preserve"> This has been made possible by advancements and the democratization of DL algorithms (Chollet 2018) along with the availability</w:t>
+      </w:r>
+      <w:r>
+        <w:rPr>
+          <w:sz w:val="24"/>
+          <w:szCs w:val="24"/>
+          <w:highlight w:val="white"/>
+        </w:rPr>
+        <w:t xml:space="preserve"> of abundant</w:t>
+      </w:r>
+      <w:r>
+        <w:rPr>
+          <w:sz w:val="24"/>
+          <w:szCs w:val="24"/>
+        </w:rPr>
+        <w:t xml:space="preserve"> previously labeled structures in </w:t>
+      </w:r>
+      <w:r>
+        <w:rPr>
+          <w:sz w:val="24"/>
+          <w:szCs w:val="24"/>
+          <w:highlight w:val="white"/>
+        </w:rPr>
+        <w:t xml:space="preserve">many production laboratories. In this context, a labeled structure would be a sampled fish for which an age has been manually estimated by a human reader. </w:t>
+      </w:r>
+      <w:r>
+        <w:rPr>
+          <w:sz w:val="24"/>
+          <w:szCs w:val="24"/>
+        </w:rPr>
+        <w:t xml:space="preserve">Recently, researchers have started </w:t>
+      </w:r>
+      <w:r>
+        <w:rPr>
+          <w:sz w:val="24"/>
+          <w:szCs w:val="24"/>
+          <w:highlight w:val="white"/>
+        </w:rPr>
+        <w:t xml:space="preserve">applying DL models, notably convolutional neural network (CNN) models, to estimate age for a variety of fish species using images of hard parts, such as otoliths and scales, as well as reflectance spectra of otoliths (Benson et al. 2023). </w:t>
+      </w:r>
+    </w:p>
+    <w:p>
+      <w:pPr>
+        <w:spacing w:before="240" w:after="240" w:line="480" w:lineRule="auto"/>
+        <w:jc w:val="left"/>
+        <w:rPr>
+          <w:sz w:val="24"/>
+          <w:szCs w:val="24"/>
+          <w:highlight w:val="white"/>
+        </w:rPr>
+      </w:pPr>
       <w:r>
         <w:rPr>
           <w:sz w:val="24"/>
@@ -886,112 +1252,64 @@
           <w:highlight w:val="white"/>
         </w:rPr>
         <w:lastRenderedPageBreak/>
-        <w:t xml:space="preserve">(McNicol and MacLellan 2010). The general pattern for Pacific salmon is rapid growth in the spring and summer producing wide spacing between the </w:t>
-      </w:r>
-      <w:proofErr w:type="spellStart"/>
-      <w:r>
-        <w:rPr>
-          <w:sz w:val="24"/>
-          <w:szCs w:val="24"/>
-          <w:highlight w:val="white"/>
-        </w:rPr>
-        <w:t>circuli</w:t>
-      </w:r>
-      <w:proofErr w:type="spellEnd"/>
-      <w:r>
-        <w:rPr>
-          <w:sz w:val="24"/>
-          <w:szCs w:val="24"/>
-          <w:highlight w:val="white"/>
-        </w:rPr>
-        <w:t xml:space="preserve">, and slow growth in the fall and winter producing narrow </w:t>
-      </w:r>
-      <w:proofErr w:type="spellStart"/>
-      <w:r>
-        <w:rPr>
-          <w:sz w:val="24"/>
-          <w:szCs w:val="24"/>
-          <w:highlight w:val="white"/>
-        </w:rPr>
-        <w:t>circuli</w:t>
-      </w:r>
-      <w:proofErr w:type="spellEnd"/>
-      <w:r>
-        <w:rPr>
-          <w:sz w:val="24"/>
-          <w:szCs w:val="24"/>
-          <w:highlight w:val="white"/>
-        </w:rPr>
-        <w:t xml:space="preserve"> spacing</w:t>
-      </w:r>
-      <w:r>
-        <w:rPr>
-          <w:sz w:val="24"/>
-          <w:szCs w:val="24"/>
-        </w:rPr>
-        <w:t xml:space="preserve"> (Figures S1 and S2; Clutter and Whitesel 1956;</w:t>
-      </w:r>
-      <w:r>
-        <w:rPr>
-          <w:sz w:val="24"/>
-          <w:szCs w:val="24"/>
-          <w:highlight w:val="white"/>
-        </w:rPr>
-        <w:t xml:space="preserve"> Sato et al. 1958; Barber and Walker 1988). Combined, widely spaced </w:t>
-      </w:r>
-      <w:proofErr w:type="spellStart"/>
-      <w:r>
-        <w:rPr>
-          <w:sz w:val="24"/>
-          <w:szCs w:val="24"/>
-          <w:highlight w:val="white"/>
-        </w:rPr>
-        <w:t>circuli</w:t>
-      </w:r>
-      <w:proofErr w:type="spellEnd"/>
-      <w:r>
-        <w:rPr>
-          <w:sz w:val="24"/>
-          <w:szCs w:val="24"/>
-          <w:highlight w:val="white"/>
-        </w:rPr>
-        <w:t xml:space="preserve"> followed by a band of closely spaced </w:t>
-      </w:r>
-      <w:proofErr w:type="spellStart"/>
-      <w:r>
-        <w:rPr>
-          <w:sz w:val="24"/>
-          <w:szCs w:val="24"/>
-          <w:highlight w:val="white"/>
-        </w:rPr>
-        <w:t>circuli</w:t>
-      </w:r>
-      <w:proofErr w:type="spellEnd"/>
-      <w:r>
-        <w:rPr>
-          <w:sz w:val="24"/>
-          <w:szCs w:val="24"/>
-          <w:highlight w:val="white"/>
-        </w:rPr>
-        <w:t xml:space="preserve"> form an annual growth zone or annulus (LaLanne and </w:t>
-      </w:r>
-      <w:proofErr w:type="spellStart"/>
-      <w:r>
-        <w:rPr>
-          <w:sz w:val="24"/>
-          <w:szCs w:val="24"/>
-          <w:highlight w:val="white"/>
-        </w:rPr>
-        <w:t>Safsten</w:t>
-      </w:r>
-      <w:proofErr w:type="spellEnd"/>
-      <w:r>
-        <w:rPr>
-          <w:sz w:val="24"/>
-          <w:szCs w:val="24"/>
-          <w:highlight w:val="white"/>
-        </w:rPr>
-        <w:t xml:space="preserve"> 1969; McNicol and MacLellan 2010). </w:t>
+        <w:t>CNNs are a specialized type of DL model designed for image analysis. Each image is separated into three-dimensional arrays and then passed through the CNN layers (Elgendy 2020). CNNs, like other neural networks, are a class of algorithms designed to mimic the structure and function of the visual cortex (</w:t>
+      </w:r>
+      <w:r>
+        <w:rPr>
+          <w:sz w:val="24"/>
+          <w:szCs w:val="24"/>
+        </w:rPr>
+        <w:t>Hubel and Wiesel 1962; Chen et al. 2021</w:t>
+      </w:r>
+      <w:r>
+        <w:rPr>
+          <w:sz w:val="24"/>
+          <w:szCs w:val="24"/>
+          <w:highlight w:val="white"/>
+        </w:rPr>
+        <w:t xml:space="preserve">). The main element in a neural network is </w:t>
+      </w:r>
+      <w:proofErr w:type="gramStart"/>
+      <w:r>
+        <w:rPr>
+          <w:sz w:val="24"/>
+          <w:szCs w:val="24"/>
+          <w:highlight w:val="white"/>
+        </w:rPr>
+        <w:t>the neurons</w:t>
+      </w:r>
+      <w:proofErr w:type="gramEnd"/>
+      <w:r>
+        <w:rPr>
+          <w:sz w:val="24"/>
+          <w:szCs w:val="24"/>
+          <w:highlight w:val="white"/>
+        </w:rPr>
+        <w:t xml:space="preserve">, simple units that take input signals and produce an output (Elgendy 2020). When millions of these units are organized into successive CNN layers, such as convolutional, pooling, and fully connected layers, they can learn complex features like patterns, shapes, and interactions (Elgendy 2020; James et al. 2023; </w:t>
+      </w:r>
+      <w:proofErr w:type="spellStart"/>
+      <w:r>
+        <w:rPr>
+          <w:sz w:val="24"/>
+          <w:szCs w:val="24"/>
+        </w:rPr>
+        <w:t>Géron</w:t>
+      </w:r>
+      <w:proofErr w:type="spellEnd"/>
+      <w:r>
+        <w:rPr>
+          <w:sz w:val="24"/>
+          <w:szCs w:val="24"/>
+        </w:rPr>
+        <w:t xml:space="preserve"> 2019</w:t>
+      </w:r>
+      <w:r>
+        <w:rPr>
+          <w:sz w:val="24"/>
+          <w:szCs w:val="24"/>
+          <w:highlight w:val="white"/>
+        </w:rPr>
+        <w:t>). In essence, the whole process starts with the first layers in the CNN detecting low-level features such as edges, and deeper layers capturing more complex shapes (Elgendy 2020). By stacking layers, the model learns increasingly complex patterns from each stage until an array of salient features are recognized in the image and predictions can be generated (Elgendy 2020).</w:t>
       </w:r>
     </w:p>
     <w:p>
@@ -1010,85 +1328,78 @@
           <w:szCs w:val="24"/>
           <w:highlight w:val="white"/>
         </w:rPr>
-        <w:t xml:space="preserve">Most advances in age estimation have focused on sample collection, structure </w:t>
-      </w:r>
-      <w:proofErr w:type="gramStart"/>
-      <w:r>
-        <w:rPr>
-          <w:sz w:val="24"/>
-          <w:szCs w:val="24"/>
-          <w:highlight w:val="white"/>
-        </w:rPr>
-        <w:t>processing,  microscope</w:t>
-      </w:r>
-      <w:proofErr w:type="gramEnd"/>
-      <w:r>
-        <w:rPr>
-          <w:sz w:val="24"/>
-          <w:szCs w:val="24"/>
-          <w:highlight w:val="white"/>
-        </w:rPr>
-        <w:t xml:space="preserve"> equipment, age validation, and imaging; meanwhile, improvements in machine learning, particularly a subset of machine learning called deep learning (DL), have shown strong potential in their application to estimate age of fish populations</w:t>
-      </w:r>
-      <w:r>
-        <w:rPr>
-          <w:sz w:val="24"/>
-          <w:szCs w:val="24"/>
-        </w:rPr>
-        <w:t xml:space="preserve"> (LeCun et al. 2015; </w:t>
-      </w:r>
-      <w:r>
-        <w:rPr>
-          <w:sz w:val="24"/>
-          <w:szCs w:val="24"/>
-          <w:highlight w:val="white"/>
-        </w:rPr>
-        <w:t>Moen et al. 2023; Vabø et al. 2021).</w:t>
-      </w:r>
-      <w:r>
-        <w:rPr>
-          <w:sz w:val="24"/>
-          <w:szCs w:val="24"/>
-        </w:rPr>
-        <w:t xml:space="preserve"> This has been made possible by advancements and the democratization of DL algorithms (Chollet 2018) along with the availability</w:t>
-      </w:r>
-      <w:r>
-        <w:rPr>
-          <w:sz w:val="24"/>
-          <w:szCs w:val="24"/>
-          <w:highlight w:val="white"/>
-        </w:rPr>
-        <w:t xml:space="preserve"> of abundant</w:t>
-      </w:r>
-      <w:r>
-        <w:rPr>
-          <w:sz w:val="24"/>
-          <w:szCs w:val="24"/>
-        </w:rPr>
-        <w:t xml:space="preserve"> previously labeled structures in </w:t>
-      </w:r>
-      <w:r>
-        <w:rPr>
-          <w:sz w:val="24"/>
-          <w:szCs w:val="24"/>
-          <w:highlight w:val="white"/>
-        </w:rPr>
-        <w:t xml:space="preserve">many production laboratories. In this context, a labeled structure would be a sampled fish for which an age has been manually estimated by a human reader. </w:t>
-      </w:r>
-      <w:r>
-        <w:rPr>
-          <w:sz w:val="24"/>
-          <w:szCs w:val="24"/>
-        </w:rPr>
-        <w:t xml:space="preserve">Recently, researchers have started </w:t>
-      </w:r>
-      <w:r>
-        <w:rPr>
-          <w:sz w:val="24"/>
-          <w:szCs w:val="24"/>
-          <w:highlight w:val="white"/>
-        </w:rPr>
-        <w:t xml:space="preserve">applying DL models, notably convolutional neural network (CNN) models, to estimate age for a variety of fish species using images of hard parts, such as otoliths and scales, as well as reflectance spectra of otoliths (Benson et al. 2023). </w:t>
+        <w:t xml:space="preserve">CNN models, like other DL models, require large volumes of data to train. They do not learn by fitting the model to the data once; but rather by iterating through the entire training data, with each complete pass referred to as an epoch, to optimize parameter values and reduce model error. This process can be </w:t>
+      </w:r>
+      <w:r>
+        <w:rPr>
+          <w:sz w:val="24"/>
+          <w:szCs w:val="24"/>
+        </w:rPr>
+        <w:t xml:space="preserve">computationally intensive, with time and computing resources costs dependent on the complexity of the problem and the size of the dataset. </w:t>
+      </w:r>
+      <w:r>
+        <w:rPr>
+          <w:sz w:val="24"/>
+          <w:szCs w:val="24"/>
+          <w:highlight w:val="white"/>
+        </w:rPr>
+        <w:t>Early efforts using statistical learning (</w:t>
+      </w:r>
+      <w:proofErr w:type="spellStart"/>
+      <w:r>
+        <w:rPr>
+          <w:sz w:val="24"/>
+          <w:szCs w:val="24"/>
+          <w:highlight w:val="white"/>
+        </w:rPr>
+        <w:t>Fablet</w:t>
+      </w:r>
+      <w:proofErr w:type="spellEnd"/>
+      <w:r>
+        <w:rPr>
+          <w:sz w:val="24"/>
+          <w:szCs w:val="24"/>
+          <w:highlight w:val="white"/>
+        </w:rPr>
+        <w:t xml:space="preserve"> and Le Josse 2005) and neural networks (</w:t>
+      </w:r>
+      <w:r>
+        <w:rPr>
+          <w:sz w:val="24"/>
+          <w:szCs w:val="24"/>
+        </w:rPr>
+        <w:t xml:space="preserve">Robertson and Morison 2001) </w:t>
+      </w:r>
+      <w:r>
+        <w:rPr>
+          <w:sz w:val="24"/>
+          <w:szCs w:val="24"/>
+          <w:highlight w:val="white"/>
+        </w:rPr>
+        <w:t xml:space="preserve">demonstrated their potential for tasks like age estimation, but predictive performance rarely approached that of </w:t>
+      </w:r>
+      <w:r>
+        <w:rPr>
+          <w:sz w:val="24"/>
+          <w:szCs w:val="24"/>
+        </w:rPr>
+        <w:t xml:space="preserve">experienced readers. More recently, advanced image preprocessing methods and </w:t>
+      </w:r>
+      <w:proofErr w:type="spellStart"/>
+      <w:r>
+        <w:rPr>
+          <w:sz w:val="24"/>
+          <w:szCs w:val="24"/>
+        </w:rPr>
+        <w:t>ensembling</w:t>
+      </w:r>
+      <w:proofErr w:type="spellEnd"/>
+      <w:r>
+        <w:rPr>
+          <w:sz w:val="24"/>
+          <w:szCs w:val="24"/>
+        </w:rPr>
+        <w:t xml:space="preserve"> models have been suggested to improve model performance (Riedel and Leaf 2024; Moen et al. 2023).  </w:t>
       </w:r>
     </w:p>
     <w:p>
@@ -1107,181 +1418,7 @@
           <w:szCs w:val="24"/>
           <w:highlight w:val="white"/>
         </w:rPr>
-        <w:t>CNNs are a specialized type of DL model designed for image analysis. Each image is separated into three-dimensional arrays and then passed through the CNN layers (Elgendy 2020). CNNs, like other neural networks, are a class of algorithms designed to mimic the structure and function of the visual cortex (</w:t>
-      </w:r>
-      <w:r>
-        <w:rPr>
-          <w:sz w:val="24"/>
-          <w:szCs w:val="24"/>
-        </w:rPr>
-        <w:t>Hubel and Wiesel 1962; Chen et al. 2021</w:t>
-      </w:r>
-      <w:r>
-        <w:rPr>
-          <w:sz w:val="24"/>
-          <w:szCs w:val="24"/>
-          <w:highlight w:val="white"/>
-        </w:rPr>
-        <w:t xml:space="preserve">). The main element in a neural network is </w:t>
-      </w:r>
-      <w:proofErr w:type="gramStart"/>
-      <w:r>
-        <w:rPr>
-          <w:sz w:val="24"/>
-          <w:szCs w:val="24"/>
-          <w:highlight w:val="white"/>
-        </w:rPr>
-        <w:t>the neurons</w:t>
-      </w:r>
-      <w:proofErr w:type="gramEnd"/>
-      <w:r>
-        <w:rPr>
-          <w:sz w:val="24"/>
-          <w:szCs w:val="24"/>
-          <w:highlight w:val="white"/>
-        </w:rPr>
-        <w:t xml:space="preserve">, simple units that take input signals and produce an output (Elgendy 2020). When millions of these units are organized into successive CNN layers, such as </w:t>
-      </w:r>
-      <w:r>
-        <w:rPr>
-          <w:sz w:val="24"/>
-          <w:szCs w:val="24"/>
-          <w:highlight w:val="white"/>
-        </w:rPr>
         <w:lastRenderedPageBreak/>
-        <w:t xml:space="preserve">convolutional, pooling, and fully connected layers, they can learn complex features like patterns, shapes, and interactions (Elgendy 2020; James et al. 2023; </w:t>
-      </w:r>
-      <w:proofErr w:type="spellStart"/>
-      <w:r>
-        <w:rPr>
-          <w:sz w:val="24"/>
-          <w:szCs w:val="24"/>
-        </w:rPr>
-        <w:t>Géron</w:t>
-      </w:r>
-      <w:proofErr w:type="spellEnd"/>
-      <w:r>
-        <w:rPr>
-          <w:sz w:val="24"/>
-          <w:szCs w:val="24"/>
-        </w:rPr>
-        <w:t xml:space="preserve"> 2019</w:t>
-      </w:r>
-      <w:r>
-        <w:rPr>
-          <w:sz w:val="24"/>
-          <w:szCs w:val="24"/>
-          <w:highlight w:val="white"/>
-        </w:rPr>
-        <w:t>). In essence, the whole process starts with the first layers in the CNN detecting low-level features such as edges, and deeper layers capturing more complex shapes (Elgendy 2020). By stacking layers, the model learns increasingly complex patterns from each stage until an array of salient features are recognized in the image and predictions can be generated (Elgendy 2020).</w:t>
-      </w:r>
-    </w:p>
-    <w:p>
-      <w:pPr>
-        <w:spacing w:before="240" w:after="240" w:line="480" w:lineRule="auto"/>
-        <w:jc w:val="left"/>
-        <w:rPr>
-          <w:sz w:val="24"/>
-          <w:szCs w:val="24"/>
-          <w:highlight w:val="white"/>
-        </w:rPr>
-      </w:pPr>
-      <w:r>
-        <w:rPr>
-          <w:sz w:val="24"/>
-          <w:szCs w:val="24"/>
-          <w:highlight w:val="white"/>
-        </w:rPr>
-        <w:t xml:space="preserve">CNN models, like other DL models, require large volumes of data to train. They do not learn by fitting the model to the data once; but rather by iterating through the entire training data, with each complete pass referred to as an epoch, to optimize parameter values and reduce model error. This process can be </w:t>
-      </w:r>
-      <w:r>
-        <w:rPr>
-          <w:sz w:val="24"/>
-          <w:szCs w:val="24"/>
-        </w:rPr>
-        <w:t xml:space="preserve">computationally intensive, with time and computing resources costs dependent on the complexity of the problem and the size of the dataset. </w:t>
-      </w:r>
-      <w:r>
-        <w:rPr>
-          <w:sz w:val="24"/>
-          <w:szCs w:val="24"/>
-          <w:highlight w:val="white"/>
-        </w:rPr>
-        <w:t>Early efforts using statistical learning (</w:t>
-      </w:r>
-      <w:proofErr w:type="spellStart"/>
-      <w:r>
-        <w:rPr>
-          <w:sz w:val="24"/>
-          <w:szCs w:val="24"/>
-          <w:highlight w:val="white"/>
-        </w:rPr>
-        <w:t>Fablet</w:t>
-      </w:r>
-      <w:proofErr w:type="spellEnd"/>
-      <w:r>
-        <w:rPr>
-          <w:sz w:val="24"/>
-          <w:szCs w:val="24"/>
-          <w:highlight w:val="white"/>
-        </w:rPr>
-        <w:t xml:space="preserve"> and Le Josse 2005) and neural networks (</w:t>
-      </w:r>
-      <w:r>
-        <w:rPr>
-          <w:sz w:val="24"/>
-          <w:szCs w:val="24"/>
-        </w:rPr>
-        <w:t xml:space="preserve">Robertson and Morison 2001) </w:t>
-      </w:r>
-      <w:r>
-        <w:rPr>
-          <w:sz w:val="24"/>
-          <w:szCs w:val="24"/>
-          <w:highlight w:val="white"/>
-        </w:rPr>
-        <w:t xml:space="preserve">demonstrated their potential for tasks like age estimation, but predictive performance rarely approached that of </w:t>
-      </w:r>
-      <w:r>
-        <w:rPr>
-          <w:sz w:val="24"/>
-          <w:szCs w:val="24"/>
-        </w:rPr>
-        <w:t xml:space="preserve">experienced readers. More recently, advanced image preprocessing methods and </w:t>
-      </w:r>
-      <w:proofErr w:type="spellStart"/>
-      <w:r>
-        <w:rPr>
-          <w:sz w:val="24"/>
-          <w:szCs w:val="24"/>
-        </w:rPr>
-        <w:t>ensembling</w:t>
-      </w:r>
-      <w:proofErr w:type="spellEnd"/>
-      <w:r>
-        <w:rPr>
-          <w:sz w:val="24"/>
-          <w:szCs w:val="24"/>
-        </w:rPr>
-        <w:t xml:space="preserve"> models have been suggested to improve model performance (Riedel and Leaf 2024; Moen et al. 2023).  </w:t>
-      </w:r>
-    </w:p>
-    <w:p>
-      <w:pPr>
-        <w:spacing w:before="240" w:after="240" w:line="480" w:lineRule="auto"/>
-        <w:jc w:val="left"/>
-        <w:rPr>
-          <w:sz w:val="24"/>
-          <w:szCs w:val="24"/>
-          <w:highlight w:val="white"/>
-        </w:rPr>
-      </w:pPr>
-      <w:r>
-        <w:rPr>
-          <w:sz w:val="24"/>
-          <w:szCs w:val="24"/>
-          <w:highlight w:val="white"/>
-        </w:rPr>
         <w:t xml:space="preserve">The production of quality salmon age estimates depends on the consistent application of pattern recognition criteria. This typically involves a quality control approach, often including independent estimates from multiple readers, that consists of high-quality viewing and imaging equipment, training programs, and age estimation methods validated through the examination of known age samples (MacLellan and Gillespie 2015; Anderson et al. 2023). </w:t>
       </w:r>
       <w:r>
@@ -1316,15 +1453,7 @@
           <w:sz w:val="24"/>
           <w:szCs w:val="24"/>
         </w:rPr>
-        <w:t xml:space="preserve">, Salmonidae) origin (wild vs. hatchery) </w:t>
-      </w:r>
-      <w:r>
-        <w:rPr>
-          <w:sz w:val="24"/>
-          <w:szCs w:val="24"/>
-        </w:rPr>
-        <w:lastRenderedPageBreak/>
-        <w:t xml:space="preserve">and spawning history, but only moderate agreement for sea age (87%) and lower agreement for river age (63%; </w:t>
+        <w:t xml:space="preserve">, Salmonidae) origin (wild vs. hatchery) and spawning history, but only moderate agreement for sea age (87%) and lower agreement for river age (63%; </w:t>
       </w:r>
       <w:r>
         <w:rPr>
@@ -1456,6 +1585,7 @@
           <w:sz w:val="24"/>
           <w:szCs w:val="24"/>
         </w:rPr>
+        <w:lastRenderedPageBreak/>
         <w:t xml:space="preserve">Chum salmon scales were collected by four agencies: the National Oceanic and Atmospheric Administration (NOAA), Alaska Department of Fish and Game (ADF&amp;G), Northern Southeast Regional Aquaculture Association (NSRAA), and Department of Fisheries and Oceans Canada (DFO; Appendix Table A1). All groups prepared scales similarly for age estimation; scales were mounted to a gum </w:t>
       </w:r>
       <w:proofErr w:type="gramStart"/>
@@ -1488,15 +1618,7 @@
           <w:sz w:val="24"/>
           <w:szCs w:val="24"/>
         </w:rPr>
-        <w:t xml:space="preserve"> provided in the Agency </w:t>
-      </w:r>
-      <w:r>
-        <w:rPr>
-          <w:sz w:val="24"/>
-          <w:szCs w:val="24"/>
-        </w:rPr>
-        <w:lastRenderedPageBreak/>
-        <w:t xml:space="preserve">scale datasets section of the supplemental text. The workflow for scale image preprocessing, model training, and evaluation is shown in Supplemental Figure S3. Among the agencies, scale images were taken with variable equipment, magnifications and resolutions. </w:t>
+        <w:t xml:space="preserve"> provided in the Agency scale datasets section of the supplemental text. The workflow for scale image preprocessing, model training, and evaluation is shown in Supplemental Figure S3. Among the agencies, scale images were taken with variable equipment, magnifications and resolutions. </w:t>
       </w:r>
       <w:r>
         <w:rPr>
@@ -1563,6 +1685,7 @@
       <w:bookmarkStart w:id="1" w:name="_2v1nd9x3e356" w:colFirst="0" w:colLast="0"/>
       <w:bookmarkEnd w:id="1"/>
       <w:r>
+        <w:lastRenderedPageBreak/>
         <w:t xml:space="preserve">AI Server </w:t>
       </w:r>
     </w:p>
@@ -1609,7 +1732,6 @@
       <w:bookmarkStart w:id="2" w:name="_59mmh7qmuqok" w:colFirst="0" w:colLast="0"/>
       <w:bookmarkEnd w:id="2"/>
       <w:r>
-        <w:lastRenderedPageBreak/>
         <w:t>Preprocessing</w:t>
       </w:r>
     </w:p>
@@ -1645,7 +1767,7 @@
         </w:rPr>
         <w:t xml:space="preserve"> (</w:t>
       </w:r>
-      <w:hyperlink r:id="rId7">
+      <w:hyperlink r:id="rId6">
         <w:r>
           <w:rPr>
             <w:sz w:val="24"/>
@@ -1676,24 +1798,7 @@
           <w:sz w:val="24"/>
           <w:szCs w:val="24"/>
         </w:rPr>
-        <w:t>Some of the scale images from the NOAA collection were blurry, grainy, and generally of low quality. These poor-quality images were removed from the study by filtering on the variance of the Laplacian score (LS), an image focus measure where lower values indicate greater image blur (Pech-Pacheco et al. 2000). A particularly noisy image will have random local structure resulting in a low LS. An LS of 300 was determined to be a suitable threshold for filtering out poor quality images from the NOAA collection.</w:t>
-      </w:r>
-    </w:p>
-    <w:p>
-      <w:pPr>
-        <w:spacing w:line="480" w:lineRule="auto"/>
-        <w:jc w:val="left"/>
-        <w:rPr>
-          <w:sz w:val="24"/>
-          <w:szCs w:val="24"/>
-        </w:rPr>
-      </w:pPr>
-      <w:r>
-        <w:rPr>
-          <w:sz w:val="24"/>
-          <w:szCs w:val="24"/>
-        </w:rPr>
-        <w:t xml:space="preserve">In addition to SAM or YOLO processing, standardization of image format, a requirement of model inputs, was accomplished by converting to RGB format (three channels), resizing, and </w:t>
+        <w:t xml:space="preserve">Some of the scale images from the NOAA collection were blurry, grainy, and generally of low quality. These poor-quality images were removed from the study by filtering on the variance of </w:t>
       </w:r>
       <w:r>
         <w:rPr>
@@ -1701,7 +1806,24 @@
           <w:szCs w:val="24"/>
         </w:rPr>
         <w:lastRenderedPageBreak/>
-        <w:t xml:space="preserve">normalizing all images; conversion to three channels and resizing to 512 by 512 pixels provided a balance between maximizing signal within the image and reducing memory usage. Finally, image pixel values were normalized [0,1] to boost learning and accelerate network convergence (Elgendy 2020). </w:t>
+        <w:t>the Laplacian score (LS), an image focus measure where lower values indicate greater image blur (Pech-Pacheco et al. 2000). A particularly noisy image will have random local structure resulting in a low LS. An LS of 300 was determined to be a suitable threshold for filtering out poor quality images from the NOAA collection.</w:t>
+      </w:r>
+    </w:p>
+    <w:p>
+      <w:pPr>
+        <w:spacing w:line="480" w:lineRule="auto"/>
+        <w:jc w:val="left"/>
+        <w:rPr>
+          <w:sz w:val="24"/>
+          <w:szCs w:val="24"/>
+        </w:rPr>
+      </w:pPr>
+      <w:r>
+        <w:rPr>
+          <w:sz w:val="24"/>
+          <w:szCs w:val="24"/>
+        </w:rPr>
+        <w:t xml:space="preserve">In addition to SAM or YOLO processing, standardization of image format, a requirement of model inputs, was accomplished by converting to RGB format (three channels), resizing, and normalizing all images; conversion to three channels and resizing to 512 by 512 pixels provided a balance between maximizing signal within the image and reducing memory usage. Finally, image pixel values were normalized [0,1] to boost learning and accelerate network convergence (Elgendy 2020). </w:t>
       </w:r>
     </w:p>
     <w:p>
@@ -1857,6 +1979,7 @@
           <w:sz w:val="24"/>
           <w:szCs w:val="24"/>
         </w:rPr>
+        <w:lastRenderedPageBreak/>
         <w:t xml:space="preserve">We deployed an ensemble of three CNN models (Python code from </w:t>
       </w:r>
       <w:proofErr w:type="spellStart"/>
@@ -1905,7 +2028,97 @@
           <w:sz w:val="24"/>
           <w:szCs w:val="24"/>
         </w:rPr>
-        <w:t xml:space="preserve">. Each of the three models were trained independently, using two training phases. The first phase included the use of pre-trained weights from ImageNet, a large hand-annotated image dataset used for visual object recognition, to initialize the CNN models. The first third of the model's neural network was frozen (non-trainable). The models relied on the benefit of transfer learning to reduce the volume of data </w:t>
+        <w:t>. Each of the three models were trained independently, using two training phases. The first phase included the use of pre-trained weights from ImageNet, a large hand-annotated image dataset used for visual object recognition, to initialize the CNN models. The first third of the model's neural network was frozen (non-trainable). The models relied on the benefit of transfer learning to reduce the volume of data necessary to train and to shorten training time. Once the models began to converge, training was paused. To fine tune and optimize models, they were recompiled, learning rates were reduced, each model's entire neural network was unfrozen, and training was then resumed (Chollet 2018).</w:t>
+      </w:r>
+    </w:p>
+    <w:p>
+      <w:pPr>
+        <w:spacing w:line="480" w:lineRule="auto"/>
+        <w:jc w:val="left"/>
+        <w:rPr>
+          <w:sz w:val="24"/>
+          <w:szCs w:val="24"/>
+        </w:rPr>
+      </w:pPr>
+      <w:r>
+        <w:rPr>
+          <w:sz w:val="24"/>
+          <w:szCs w:val="24"/>
+        </w:rPr>
+        <w:t xml:space="preserve">Models were trained using the training dataset, with the validation data used for model tuning and for selecting the best network weights from each sequence </w:t>
+      </w:r>
+      <w:r>
+        <w:rPr>
+          <w:sz w:val="24"/>
+          <w:szCs w:val="24"/>
+          <w:highlight w:val="white"/>
+        </w:rPr>
+        <w:t>(James et al. 2023)</w:t>
+      </w:r>
+      <w:r>
+        <w:rPr>
+          <w:sz w:val="24"/>
+          <w:szCs w:val="24"/>
+        </w:rPr>
+        <w:t xml:space="preserve">. The three model architectures differed but used the same hyperparameters and model head configurations (Appendix Table A2). Global average pooling was used to simplify final feature maps, reducing dimensionality, computational cost, and processing time. This technique preserves the important features while shrinking the spatial dimensions, </w:t>
+      </w:r>
+      <w:proofErr w:type="gramStart"/>
+      <w:r>
+        <w:rPr>
+          <w:sz w:val="24"/>
+          <w:szCs w:val="24"/>
+        </w:rPr>
+        <w:t>similar to</w:t>
+      </w:r>
+      <w:proofErr w:type="gramEnd"/>
+      <w:r>
+        <w:rPr>
+          <w:sz w:val="24"/>
+          <w:szCs w:val="24"/>
+        </w:rPr>
+        <w:t xml:space="preserve"> an image-compression program (Elgendy 2020). We chose a computationally heavy dense layer for the fully connected layer (4096 neurons) to balance feature loss from averaging and to preserve scale signal.</w:t>
+      </w:r>
+    </w:p>
+    <w:p>
+      <w:pPr>
+        <w:spacing w:line="480" w:lineRule="auto"/>
+        <w:jc w:val="left"/>
+        <w:rPr>
+          <w:sz w:val="24"/>
+          <w:szCs w:val="24"/>
+        </w:rPr>
+      </w:pPr>
+    </w:p>
+    <w:p>
+      <w:pPr>
+        <w:spacing w:line="480" w:lineRule="auto"/>
+        <w:jc w:val="left"/>
+        <w:rPr>
+          <w:sz w:val="24"/>
+          <w:szCs w:val="24"/>
+        </w:rPr>
+      </w:pPr>
+      <w:r>
+        <w:rPr>
+          <w:sz w:val="24"/>
+          <w:szCs w:val="24"/>
+        </w:rPr>
+        <w:t>For each model, the configuration with the lowest loss and MSE during training was serialized, with both the architecture and weights saved (</w:t>
+      </w:r>
+      <w:r>
+        <w:rPr>
+          <w:sz w:val="24"/>
+          <w:szCs w:val="24"/>
+          <w:highlight w:val="white"/>
+        </w:rPr>
+        <w:t>see model fitting details in Supplemental Text</w:t>
+      </w:r>
+      <w:r>
+        <w:rPr>
+          <w:sz w:val="24"/>
+          <w:szCs w:val="24"/>
+        </w:rPr>
+        <w:t xml:space="preserve">). After the models were trained, they were independently evaluated on the test data, and their </w:t>
       </w:r>
       <w:r>
         <w:rPr>
@@ -1913,97 +2126,7 @@
           <w:szCs w:val="24"/>
         </w:rPr>
         <w:lastRenderedPageBreak/>
-        <w:t>necessary to train and to shorten training time. Once the models began to converge, training was paused. To fine tune and optimize models, they were recompiled, learning rates were reduced, each model's entire neural network was unfrozen, and training was then resumed (Chollet 2018).</w:t>
-      </w:r>
-    </w:p>
-    <w:p>
-      <w:pPr>
-        <w:spacing w:line="480" w:lineRule="auto"/>
-        <w:jc w:val="left"/>
-        <w:rPr>
-          <w:sz w:val="24"/>
-          <w:szCs w:val="24"/>
-        </w:rPr>
-      </w:pPr>
-      <w:r>
-        <w:rPr>
-          <w:sz w:val="24"/>
-          <w:szCs w:val="24"/>
-        </w:rPr>
-        <w:t xml:space="preserve">Models were trained using the training dataset, with the validation data used for model tuning and for selecting the best network weights from each sequence </w:t>
-      </w:r>
-      <w:r>
-        <w:rPr>
-          <w:sz w:val="24"/>
-          <w:szCs w:val="24"/>
-          <w:highlight w:val="white"/>
-        </w:rPr>
-        <w:t>(James et al. 2023)</w:t>
-      </w:r>
-      <w:r>
-        <w:rPr>
-          <w:sz w:val="24"/>
-          <w:szCs w:val="24"/>
-        </w:rPr>
-        <w:t xml:space="preserve">. The three model architectures differed but used the same hyperparameters and model head configurations (Appendix Table A2). Global average pooling was used to simplify final feature maps, reducing dimensionality, computational cost, and processing time. This technique preserves the important features while shrinking the spatial dimensions, </w:t>
-      </w:r>
-      <w:proofErr w:type="gramStart"/>
-      <w:r>
-        <w:rPr>
-          <w:sz w:val="24"/>
-          <w:szCs w:val="24"/>
-        </w:rPr>
-        <w:t>similar to</w:t>
-      </w:r>
-      <w:proofErr w:type="gramEnd"/>
-      <w:r>
-        <w:rPr>
-          <w:sz w:val="24"/>
-          <w:szCs w:val="24"/>
-        </w:rPr>
-        <w:t xml:space="preserve"> an image-compression program (Elgendy 2020). We chose a computationally heavy dense layer for the fully connected layer (4096 neurons) to balance feature loss from averaging and to preserve scale signal.</w:t>
-      </w:r>
-    </w:p>
-    <w:p>
-      <w:pPr>
-        <w:spacing w:line="480" w:lineRule="auto"/>
-        <w:jc w:val="left"/>
-        <w:rPr>
-          <w:sz w:val="24"/>
-          <w:szCs w:val="24"/>
-        </w:rPr>
-      </w:pPr>
-    </w:p>
-    <w:p>
-      <w:pPr>
-        <w:spacing w:line="480" w:lineRule="auto"/>
-        <w:jc w:val="left"/>
-        <w:rPr>
-          <w:sz w:val="24"/>
-          <w:szCs w:val="24"/>
-        </w:rPr>
-      </w:pPr>
-      <w:r>
-        <w:rPr>
-          <w:sz w:val="24"/>
-          <w:szCs w:val="24"/>
-        </w:rPr>
-        <w:t>For each model, the configuration with the lowest loss and MSE during training was serialized, with both the architecture and weights saved (</w:t>
-      </w:r>
-      <w:r>
-        <w:rPr>
-          <w:sz w:val="24"/>
-          <w:szCs w:val="24"/>
-          <w:highlight w:val="white"/>
-        </w:rPr>
-        <w:t>see model fitting details in Supplemental Text</w:t>
-      </w:r>
-      <w:r>
-        <w:rPr>
-          <w:sz w:val="24"/>
-          <w:szCs w:val="24"/>
-        </w:rPr>
-        <w:t xml:space="preserve">). After the models were trained, they were independently evaluated on the test data, and their predictions were averaged during inference to generate the final predictions. A weighted average was calculated based on the inverse validation MSE from training, giving more weight to the best performing model (Chollet 2018). </w:t>
+        <w:t xml:space="preserve">predictions were averaged during inference to generate the final predictions. A weighted average was calculated based on the inverse validation MSE from training, giving more weight to the best performing model (Chollet 2018). </w:t>
       </w:r>
     </w:p>
     <w:p>
@@ -2037,7 +2160,6 @@
           <w:sz w:val="24"/>
           <w:szCs w:val="24"/>
         </w:rPr>
-        <w:lastRenderedPageBreak/>
         <w:t xml:space="preserve">The accuracy and precision of model-inferred age estimates must be assessed prior to assimilation into the stock assessment process, to determine the relative agreement between model predictions and manually derived age labels for a given age class. In the context of traditional age estimation, error takes two forms: accuracy and precision (Beamish and Fournier 1981; Beamish and McFarlane 1995). Accuracy is a measure of process error or the closeness to the true age and is assessed by validation approaches, such as thermal marking, mark recapture, or coded wire tag, while precision is the measure of interpretational error or the reproducibility of repeated age estimates on a given structure (Campana 2001). For this study, model accuracy could not be calculated because the true age of most scales was unknown. Instead, model agreement was calculated as the proportion of model-inferred ages in concordance with the assigned age label </w:t>
       </w:r>
       <w:r>
@@ -2075,7 +2197,15 @@
           <w:sz w:val="24"/>
           <w:szCs w:val="24"/>
         </w:rPr>
-        <w:t>To evaluate potential reasons for mismatches in the predictions, all scale images for which there were discrepancies between the model and original label were evaluated again by skilled personnel from ADF&amp;G and DFO. All images originally included an age label provided by the source agency. The reviewers were given only the original image (</w:t>
+        <w:t xml:space="preserve">To evaluate potential reasons for mismatches in the predictions, all scale images for which there were discrepancies between the model and original label were evaluated again by skilled </w:t>
+      </w:r>
+      <w:r>
+        <w:rPr>
+          <w:sz w:val="24"/>
+          <w:szCs w:val="24"/>
+        </w:rPr>
+        <w:lastRenderedPageBreak/>
+        <w:t>personnel from ADF&amp;G and DFO. All images originally included an age label provided by the source agency. The reviewers were given only the original image (</w:t>
       </w:r>
       <w:r>
         <w:rPr>
@@ -2145,7 +2275,6 @@
           <w:sz w:val="30"/>
           <w:szCs w:val="30"/>
         </w:rPr>
-        <w:lastRenderedPageBreak/>
         <w:t xml:space="preserve">Updated training of </w:t>
       </w:r>
       <w:r>
@@ -2299,6 +2428,7 @@
           <w:sz w:val="24"/>
           <w:szCs w:val="24"/>
         </w:rPr>
+        <w:lastRenderedPageBreak/>
         <w:t xml:space="preserve">A total of 66,153 labeled scale images were collected from four agencies and of those, over 92% were aged 4 and 5 (the dominant ages of returning chum salmon). This large imbalance among age classes in the dataset could create bias toward the major age classes, leading to inaccurate inference of minor age classes (Guo et al. 2008). To minimize these biases, we </w:t>
       </w:r>
       <w:proofErr w:type="spellStart"/>
@@ -2333,7 +2463,6 @@
         <w:rPr>
           <w:color w:val="000000"/>
         </w:rPr>
-        <w:lastRenderedPageBreak/>
         <w:t xml:space="preserve">CNN Models </w:t>
       </w:r>
     </w:p>
@@ -2496,7 +2625,16 @@
           <w:szCs w:val="24"/>
           <w:highlight w:val="white"/>
         </w:rPr>
-        <w:t xml:space="preserve">SAM approach had lower validation MSE (mean = 0.0806, </w:t>
+        <w:t xml:space="preserve">SAM approach had </w:t>
+      </w:r>
+      <w:r>
+        <w:rPr>
+          <w:sz w:val="24"/>
+          <w:szCs w:val="24"/>
+          <w:highlight w:val="white"/>
+        </w:rPr>
+        <w:lastRenderedPageBreak/>
+        <w:t xml:space="preserve">lower validation MSE (mean = 0.0806, </w:t>
       </w:r>
       <w:proofErr w:type="spellStart"/>
       <w:r>
@@ -2651,76 +2789,211 @@
       <w:bookmarkStart w:id="9" w:name="_oyyvboy1h06g" w:colFirst="0" w:colLast="0"/>
       <w:bookmarkEnd w:id="9"/>
       <w:r>
+        <w:t>Test Data</w:t>
+      </w:r>
+    </w:p>
+    <w:p>
+      <w:pPr>
+        <w:spacing w:line="480" w:lineRule="auto"/>
+        <w:jc w:val="left"/>
+        <w:rPr>
+          <w:sz w:val="24"/>
+          <w:szCs w:val="24"/>
+        </w:rPr>
+      </w:pPr>
+      <w:r>
+        <w:rPr>
+          <w:sz w:val="24"/>
+          <w:szCs w:val="24"/>
+        </w:rPr>
+        <w:t xml:space="preserve">Initially, all models showed consistent generalization to the test datasets, with the </w:t>
+      </w:r>
+      <w:r>
+        <w:rPr>
+          <w:sz w:val="24"/>
+          <w:szCs w:val="24"/>
+          <w:highlight w:val="white"/>
+        </w:rPr>
+        <w:t xml:space="preserve">SAMs having lower MSE (mean = 0.0947, </w:t>
+      </w:r>
+      <w:proofErr w:type="spellStart"/>
+      <w:r>
+        <w:rPr>
+          <w:sz w:val="24"/>
+          <w:szCs w:val="24"/>
+          <w:highlight w:val="white"/>
+        </w:rPr>
+        <w:t>sd</w:t>
+      </w:r>
+      <w:proofErr w:type="spellEnd"/>
+      <w:r>
+        <w:rPr>
+          <w:sz w:val="24"/>
+          <w:szCs w:val="24"/>
+          <w:highlight w:val="white"/>
+        </w:rPr>
+        <w:t xml:space="preserve"> = 0.0074) compared to the YOLO models (mean = 0.1078, </w:t>
+      </w:r>
+      <w:proofErr w:type="spellStart"/>
+      <w:r>
+        <w:rPr>
+          <w:sz w:val="24"/>
+          <w:szCs w:val="24"/>
+          <w:highlight w:val="white"/>
+        </w:rPr>
+        <w:t>sd</w:t>
+      </w:r>
+      <w:proofErr w:type="spellEnd"/>
+      <w:r>
+        <w:rPr>
+          <w:sz w:val="24"/>
+          <w:szCs w:val="24"/>
+          <w:highlight w:val="white"/>
+        </w:rPr>
+        <w:t xml:space="preserve"> = 0.0028). Further, </w:t>
+      </w:r>
+      <w:r>
+        <w:rPr>
+          <w:sz w:val="24"/>
+          <w:szCs w:val="24"/>
+        </w:rPr>
+        <w:t>all models produced strong agreement with age estimates for the most frequent age classes (</w:t>
+      </w:r>
+      <w:proofErr w:type="gramStart"/>
+      <w:r>
+        <w:rPr>
+          <w:sz w:val="24"/>
+          <w:szCs w:val="24"/>
+        </w:rPr>
+        <w:t>3-5 year-olds</w:t>
+      </w:r>
+      <w:proofErr w:type="gramEnd"/>
+      <w:r>
+        <w:rPr>
+          <w:sz w:val="24"/>
+          <w:szCs w:val="24"/>
+        </w:rPr>
+        <w:t xml:space="preserve">). Agreement for the most frequent age classes ranged from 88.7% on age 5 fish for the </w:t>
+      </w:r>
+      <w:proofErr w:type="spellStart"/>
+      <w:r>
+        <w:rPr>
+          <w:sz w:val="24"/>
+          <w:szCs w:val="24"/>
+        </w:rPr>
+        <w:t>NASNetLarge</w:t>
+      </w:r>
+      <w:proofErr w:type="spellEnd"/>
+      <w:r>
+        <w:rPr>
+          <w:sz w:val="24"/>
+          <w:szCs w:val="24"/>
+        </w:rPr>
+        <w:t xml:space="preserve"> model trained using YOLO images to 95.0% on age 3 fish for the EfficientNetV2L model trained on SAM images. Averaged across all models, agreement was highest for age 4 fish (92.7%, 0.9% </w:t>
+      </w:r>
+      <w:proofErr w:type="spellStart"/>
+      <w:r>
+        <w:rPr>
+          <w:sz w:val="24"/>
+          <w:szCs w:val="24"/>
+        </w:rPr>
+        <w:t>sd</w:t>
+      </w:r>
+      <w:proofErr w:type="spellEnd"/>
+      <w:r>
+        <w:rPr>
+          <w:sz w:val="24"/>
+          <w:szCs w:val="24"/>
+        </w:rPr>
+        <w:t xml:space="preserve">), followed by age 3 (91.7%, 2.3% </w:t>
+      </w:r>
+      <w:proofErr w:type="spellStart"/>
+      <w:r>
+        <w:rPr>
+          <w:sz w:val="24"/>
+          <w:szCs w:val="24"/>
+        </w:rPr>
+        <w:t>sd</w:t>
+      </w:r>
+      <w:proofErr w:type="spellEnd"/>
+      <w:r>
+        <w:rPr>
+          <w:sz w:val="24"/>
+          <w:szCs w:val="24"/>
+        </w:rPr>
+        <w:t xml:space="preserve">), and age 5 (89.9%, 0.8% </w:t>
+      </w:r>
+      <w:proofErr w:type="spellStart"/>
+      <w:r>
+        <w:rPr>
+          <w:sz w:val="24"/>
+          <w:szCs w:val="24"/>
+        </w:rPr>
+        <w:t>sd</w:t>
+      </w:r>
+      <w:proofErr w:type="spellEnd"/>
+      <w:r>
+        <w:rPr>
+          <w:sz w:val="24"/>
+          <w:szCs w:val="24"/>
+        </w:rPr>
+        <w:t xml:space="preserve">) fish. The three individual models had relatively similar performance, averaged </w:t>
+      </w:r>
+      <w:proofErr w:type="gramStart"/>
+      <w:r>
+        <w:rPr>
+          <w:sz w:val="24"/>
+          <w:szCs w:val="24"/>
+        </w:rPr>
+        <w:t>over preprocessing</w:t>
+      </w:r>
+      <w:proofErr w:type="gramEnd"/>
+      <w:r>
+        <w:rPr>
+          <w:sz w:val="24"/>
+          <w:szCs w:val="24"/>
+        </w:rPr>
+        <w:t xml:space="preserve"> methods; however, each of the models had lower performance with YOLO compared to SAM preprocessing. The ensemble models had the highest agreement </w:t>
+      </w:r>
+      <w:proofErr w:type="gramStart"/>
+      <w:r>
+        <w:rPr>
+          <w:sz w:val="24"/>
+          <w:szCs w:val="24"/>
+        </w:rPr>
+        <w:t>averaged</w:t>
+      </w:r>
+      <w:proofErr w:type="gramEnd"/>
+      <w:r>
+        <w:rPr>
+          <w:sz w:val="24"/>
+          <w:szCs w:val="24"/>
+        </w:rPr>
+        <w:t xml:space="preserve"> over all ages; however, the EfficientNetV2L was marginally better than the ensemble model for ages 2 and 3 fish (Figure 3). For the major age classes (</w:t>
+      </w:r>
+      <w:proofErr w:type="gramStart"/>
+      <w:r>
+        <w:rPr>
+          <w:sz w:val="24"/>
+          <w:szCs w:val="24"/>
+        </w:rPr>
+        <w:t>3-5 year-olds</w:t>
+      </w:r>
+      <w:proofErr w:type="gramEnd"/>
+      <w:r>
+        <w:rPr>
+          <w:sz w:val="24"/>
+          <w:szCs w:val="24"/>
+        </w:rPr>
+        <w:t xml:space="preserve">), ensemble model agreement was 93.2% for the SAM preprocessed images and 91.4% for the YOLO preprocessed images. Most discrepancies in age estimation between the models and original label were +/- 1 </w:t>
+      </w:r>
+      <w:r>
+        <w:rPr>
+          <w:sz w:val="24"/>
+          <w:szCs w:val="24"/>
+        </w:rPr>
         <w:lastRenderedPageBreak/>
-        <w:t>Test Data</w:t>
-      </w:r>
-    </w:p>
-    <w:p>
-      <w:pPr>
-        <w:spacing w:line="480" w:lineRule="auto"/>
-        <w:jc w:val="left"/>
-        <w:rPr>
-          <w:sz w:val="24"/>
-          <w:szCs w:val="24"/>
-        </w:rPr>
-      </w:pPr>
-      <w:r>
-        <w:rPr>
-          <w:sz w:val="24"/>
-          <w:szCs w:val="24"/>
-        </w:rPr>
-        <w:t xml:space="preserve">Initially, all models showed consistent generalization to the test datasets, with the </w:t>
-      </w:r>
-      <w:r>
-        <w:rPr>
-          <w:sz w:val="24"/>
-          <w:szCs w:val="24"/>
-          <w:highlight w:val="white"/>
-        </w:rPr>
-        <w:t xml:space="preserve">SAMs having lower MSE (mean = 0.0947, </w:t>
-      </w:r>
-      <w:proofErr w:type="spellStart"/>
-      <w:r>
-        <w:rPr>
-          <w:sz w:val="24"/>
-          <w:szCs w:val="24"/>
-          <w:highlight w:val="white"/>
-        </w:rPr>
-        <w:t>sd</w:t>
-      </w:r>
-      <w:proofErr w:type="spellEnd"/>
-      <w:r>
-        <w:rPr>
-          <w:sz w:val="24"/>
-          <w:szCs w:val="24"/>
-          <w:highlight w:val="white"/>
-        </w:rPr>
-        <w:t xml:space="preserve"> = 0.0074) compared to the YOLO models (mean = 0.1078, </w:t>
-      </w:r>
-      <w:proofErr w:type="spellStart"/>
-      <w:r>
-        <w:rPr>
-          <w:sz w:val="24"/>
-          <w:szCs w:val="24"/>
-          <w:highlight w:val="white"/>
-        </w:rPr>
-        <w:t>sd</w:t>
-      </w:r>
-      <w:proofErr w:type="spellEnd"/>
-      <w:r>
-        <w:rPr>
-          <w:sz w:val="24"/>
-          <w:szCs w:val="24"/>
-          <w:highlight w:val="white"/>
-        </w:rPr>
-        <w:t xml:space="preserve"> = 0.0028). Further, </w:t>
-      </w:r>
-      <w:r>
-        <w:rPr>
-          <w:sz w:val="24"/>
-          <w:szCs w:val="24"/>
-        </w:rPr>
-        <w:t>all models produced strong agreement with age estimates for the most frequent age classes (</w:t>
+        <w:t xml:space="preserve">year, with directional bias to the most abundant age classes in the training dataset (e.g., age 2 estimated as age 3, and age 6 estimated as age 5), with </w:t>
       </w:r>
       <w:proofErr w:type="gramStart"/>
       <w:r>
@@ -2728,7 +3001,7 @@
           <w:sz w:val="24"/>
           <w:szCs w:val="24"/>
         </w:rPr>
-        <w:t>3-5 year-olds</w:t>
+        <w:t>few  +</w:t>
       </w:r>
       <w:proofErr w:type="gramEnd"/>
       <w:r>
@@ -2736,71 +3009,24 @@
           <w:sz w:val="24"/>
           <w:szCs w:val="24"/>
         </w:rPr>
-        <w:t xml:space="preserve">). Agreement for the most frequent age classes ranged from 88.7% on age 5 fish for the </w:t>
-      </w:r>
-      <w:proofErr w:type="spellStart"/>
-      <w:r>
-        <w:rPr>
-          <w:sz w:val="24"/>
-          <w:szCs w:val="24"/>
-        </w:rPr>
-        <w:t>NASNetLarge</w:t>
-      </w:r>
-      <w:proofErr w:type="spellEnd"/>
-      <w:r>
-        <w:rPr>
-          <w:sz w:val="24"/>
-          <w:szCs w:val="24"/>
-        </w:rPr>
-        <w:t xml:space="preserve"> model trained using YOLO images to 95.0% on age 3 fish for the EfficientNetV2L model trained on SAM images. Averaged across all models, agreement was highest for age 4 fish (92.7%, 0.9% </w:t>
-      </w:r>
-      <w:proofErr w:type="spellStart"/>
-      <w:r>
-        <w:rPr>
-          <w:sz w:val="24"/>
-          <w:szCs w:val="24"/>
-        </w:rPr>
-        <w:t>sd</w:t>
-      </w:r>
-      <w:proofErr w:type="spellEnd"/>
-      <w:r>
-        <w:rPr>
-          <w:sz w:val="24"/>
-          <w:szCs w:val="24"/>
-        </w:rPr>
-        <w:t xml:space="preserve">), followed by age 3 (91.7%, 2.3% </w:t>
-      </w:r>
-      <w:proofErr w:type="spellStart"/>
-      <w:r>
-        <w:rPr>
-          <w:sz w:val="24"/>
-          <w:szCs w:val="24"/>
-        </w:rPr>
-        <w:t>sd</w:t>
-      </w:r>
-      <w:proofErr w:type="spellEnd"/>
-      <w:r>
-        <w:rPr>
-          <w:sz w:val="24"/>
-          <w:szCs w:val="24"/>
-        </w:rPr>
-        <w:t xml:space="preserve">), and age 5 (89.9%, 0.8% </w:t>
-      </w:r>
-      <w:proofErr w:type="spellStart"/>
-      <w:r>
-        <w:rPr>
-          <w:sz w:val="24"/>
-          <w:szCs w:val="24"/>
-        </w:rPr>
-        <w:t>sd</w:t>
-      </w:r>
-      <w:proofErr w:type="spellEnd"/>
-      <w:r>
-        <w:rPr>
-          <w:sz w:val="24"/>
-          <w:szCs w:val="24"/>
-        </w:rPr>
-        <w:t xml:space="preserve">) fish. The three individual models had relatively similar performance, averaged </w:t>
+        <w:t xml:space="preserve">/- 2 years (Figure 4). </w:t>
+      </w:r>
+    </w:p>
+    <w:p>
+      <w:pPr>
+        <w:spacing w:line="480" w:lineRule="auto"/>
+        <w:jc w:val="left"/>
+        <w:rPr>
+          <w:sz w:val="24"/>
+          <w:szCs w:val="24"/>
+        </w:rPr>
+      </w:pPr>
+      <w:r>
+        <w:rPr>
+          <w:sz w:val="24"/>
+          <w:szCs w:val="24"/>
+        </w:rPr>
+        <w:t xml:space="preserve">The initial findings also showed that all models failed to reliably estimate ages 2 and 6. For age </w:t>
       </w:r>
       <w:proofErr w:type="gramStart"/>
       <w:r>
@@ -2808,7 +3034,7 @@
           <w:sz w:val="24"/>
           <w:szCs w:val="24"/>
         </w:rPr>
-        <w:t>over preprocessing</w:t>
+        <w:t>2 fish</w:t>
       </w:r>
       <w:proofErr w:type="gramEnd"/>
       <w:r>
@@ -2816,7 +3042,7 @@
           <w:sz w:val="24"/>
           <w:szCs w:val="24"/>
         </w:rPr>
-        <w:t xml:space="preserve"> methods; however, each of the models had lower performance with YOLO compared to SAM preprocessing. The ensemble models had the highest agreement </w:t>
+        <w:t xml:space="preserve">, while the SAM process was marginally better than the YOLO, agreement across all models was below 50%. Ensemble model agreement with age labels was 40% and 44% for the YOLO and SAM methods, respectively (Figure 3). Agreement for age 6 fish did not exceed 65%. </w:t>
       </w:r>
       <w:proofErr w:type="gramStart"/>
       <w:r>
@@ -2824,7 +3050,7 @@
           <w:sz w:val="24"/>
           <w:szCs w:val="24"/>
         </w:rPr>
-        <w:t>averaged</w:t>
+        <w:t>The majority of</w:t>
       </w:r>
       <w:proofErr w:type="gramEnd"/>
       <w:r>
@@ -2832,96 +3058,7 @@
           <w:sz w:val="24"/>
           <w:szCs w:val="24"/>
         </w:rPr>
-        <w:t xml:space="preserve"> over all ages; however, the EfficientNetV2L was marginally better than the ensemble model for ages 2 and 3 fish (Figure 3). For the major age classes (</w:t>
-      </w:r>
-      <w:proofErr w:type="gramStart"/>
-      <w:r>
-        <w:rPr>
-          <w:sz w:val="24"/>
-          <w:szCs w:val="24"/>
-        </w:rPr>
-        <w:t>3-5 year-olds</w:t>
-      </w:r>
-      <w:proofErr w:type="gramEnd"/>
-      <w:r>
-        <w:rPr>
-          <w:sz w:val="24"/>
-          <w:szCs w:val="24"/>
-        </w:rPr>
-        <w:t xml:space="preserve">), ensemble model agreement was 93.2% for the SAM preprocessed images and 91.4% for the YOLO preprocessed images. Most discrepancies in age estimation between the models and original label were +/- 1 year, with directional bias to the most abundant age classes in the training dataset (e.g., age 2 estimated as age 3, and age 6 estimated as age 5), with </w:t>
-      </w:r>
-      <w:proofErr w:type="gramStart"/>
-      <w:r>
-        <w:rPr>
-          <w:sz w:val="24"/>
-          <w:szCs w:val="24"/>
-        </w:rPr>
-        <w:t>few  +</w:t>
-      </w:r>
-      <w:proofErr w:type="gramEnd"/>
-      <w:r>
-        <w:rPr>
-          <w:sz w:val="24"/>
-          <w:szCs w:val="24"/>
-        </w:rPr>
-        <w:t xml:space="preserve">/- 2 years (Figure 4). </w:t>
-      </w:r>
-    </w:p>
-    <w:p>
-      <w:pPr>
-        <w:spacing w:line="480" w:lineRule="auto"/>
-        <w:jc w:val="left"/>
-        <w:rPr>
-          <w:sz w:val="24"/>
-          <w:szCs w:val="24"/>
-        </w:rPr>
-      </w:pPr>
-      <w:r>
-        <w:rPr>
-          <w:sz w:val="24"/>
-          <w:szCs w:val="24"/>
-        </w:rPr>
-        <w:t xml:space="preserve">The initial findings also showed that all models failed to reliably estimate ages 2 and 6. For age </w:t>
-      </w:r>
-      <w:proofErr w:type="gramStart"/>
-      <w:r>
-        <w:rPr>
-          <w:sz w:val="24"/>
-          <w:szCs w:val="24"/>
-        </w:rPr>
-        <w:t>2 fish</w:t>
-      </w:r>
-      <w:proofErr w:type="gramEnd"/>
-      <w:r>
-        <w:rPr>
-          <w:sz w:val="24"/>
-          <w:szCs w:val="24"/>
-        </w:rPr>
-        <w:t xml:space="preserve">, while the SAM process was marginally better than the YOLO, agreement across all models was below 50%. Ensemble model agreement with age labels was 40% and 44% for the YOLO and SAM methods, respectively (Figure 3). Agreement for age 6 fish did not exceed 65%. </w:t>
-      </w:r>
-      <w:proofErr w:type="gramStart"/>
-      <w:r>
-        <w:rPr>
-          <w:sz w:val="24"/>
-          <w:szCs w:val="24"/>
-        </w:rPr>
-        <w:t>The majority of</w:t>
-      </w:r>
-      <w:proofErr w:type="gramEnd"/>
-      <w:r>
-        <w:rPr>
-          <w:sz w:val="24"/>
-          <w:szCs w:val="24"/>
-        </w:rPr>
-        <w:t xml:space="preserve"> discrepancies were estimated to be a year older than their original labels. </w:t>
-      </w:r>
-      <w:r>
-        <w:rPr>
-          <w:sz w:val="24"/>
-          <w:szCs w:val="24"/>
-        </w:rPr>
-        <w:lastRenderedPageBreak/>
-        <w:t xml:space="preserve">Performance of the ensemble models varied substantially by agency across age classes (Figure 3).  </w:t>
+        <w:t xml:space="preserve"> discrepancies were estimated to be a year older than their original labels. Performance of the ensemble models varied substantially by agency across age classes (Figure 3).  </w:t>
       </w:r>
     </w:p>
     <w:p>
@@ -2967,7 +3104,15 @@
           <w:sz w:val="24"/>
           <w:szCs w:val="24"/>
         </w:rPr>
-        <w:t xml:space="preserve">When stratifying by image preprocessing method, the results were uneven (Table 1). For SAM processed images, there were 186 discrepancies between the model age and the original label. For the YOLO processed images, there were 227 discrepancies, with an overlap of 153 images (Table 1). The predicted ages from the SAM approach more closely aligned with the reviewers' age estimates than did the YOLO method. Of the 186 discrepancies from the SAM approach, 71 (38%) of the model predicted ages agreed with the updated reviewers’ age estimates, whereas of the 227 discrepancies using the YOLO method, 70 (31%) of the model ages matched the reviewers. </w:t>
+        <w:t xml:space="preserve">When stratifying by image preprocessing method, the results were uneven (Table 1). For SAM processed images, there were 186 discrepancies between the model age and the original label. For the YOLO processed images, there were 227 discrepancies, with an overlap of 153 images </w:t>
+      </w:r>
+      <w:r>
+        <w:rPr>
+          <w:sz w:val="24"/>
+          <w:szCs w:val="24"/>
+        </w:rPr>
+        <w:lastRenderedPageBreak/>
+        <w:t xml:space="preserve">(Table 1). The predicted ages from the SAM approach more closely aligned with the reviewers' age estimates than did the YOLO method. Of the 186 discrepancies from the SAM approach, 71 (38%) of the model predicted ages agreed with the updated reviewers’ age estimates, whereas of the 227 discrepancies using the YOLO method, 70 (31%) of the model ages matched the reviewers. </w:t>
       </w:r>
     </w:p>
     <w:p>
@@ -2979,7 +3124,6 @@
       <w:bookmarkStart w:id="11" w:name="_oorpbrnwcme7" w:colFirst="0" w:colLast="0"/>
       <w:bookmarkEnd w:id="11"/>
       <w:r>
-        <w:lastRenderedPageBreak/>
         <w:t xml:space="preserve">Comparison with </w:t>
       </w:r>
       <w:r>
@@ -3091,7 +3235,15 @@
           <w:sz w:val="24"/>
           <w:szCs w:val="24"/>
         </w:rPr>
-        <w:t xml:space="preserve">In this study, we compiled a scale image archive of unprecedented size to develop a DL model for salmon scale age estimation. This labeled dataset of scale images is one of the largest for a Pacific salmon species with age estimates spanning multiple decades, regions, and life-history stages. Further, these images can provide the foundation for training other salmon species models through transfer learning, as well as retraining the current DL models as new chum salmon data become available. Our effort also illustrates the potential to modernize the age estimation process to potentially accelerate the delivery of estimates for assessments and management, as well as </w:t>
+        <w:t xml:space="preserve">In this study, we compiled a scale image archive of unprecedented size to develop a DL model for salmon scale age estimation. This labeled dataset of scale images is one of the largest for a Pacific salmon species with age estimates spanning multiple decades, regions, and life-history stages. Further, these images can provide the foundation for training other salmon species </w:t>
+      </w:r>
+      <w:r>
+        <w:rPr>
+          <w:sz w:val="24"/>
+          <w:szCs w:val="24"/>
+        </w:rPr>
+        <w:lastRenderedPageBreak/>
+        <w:t xml:space="preserve">models through transfer learning, as well as retraining the current DL models as new chum salmon data become available. Our effort also illustrates the potential to modernize the age estimation process to potentially accelerate the delivery of estimates for assessments and management, as well as </w:t>
       </w:r>
       <w:r>
         <w:rPr>
@@ -3106,7 +3258,137 @@
           <w:sz w:val="24"/>
           <w:szCs w:val="24"/>
         </w:rPr>
-        <w:t xml:space="preserve">. Integrating a DL workflow in a production laboratory alongside skilled personnel could increase the overall laboratory </w:t>
+        <w:t>. Integrating a DL workflow in a production laboratory alongside skilled personnel could increase the overall laboratory throughput and meet the rising demand for age data within limited time windows, as well as providing automated sample validation or an additional layer of QA/QC.</w:t>
+      </w:r>
+    </w:p>
+    <w:p>
+      <w:pPr>
+        <w:spacing w:line="480" w:lineRule="auto"/>
+        <w:jc w:val="left"/>
+        <w:rPr>
+          <w:sz w:val="24"/>
+          <w:szCs w:val="24"/>
+        </w:rPr>
+      </w:pPr>
+      <w:r>
+        <w:rPr>
+          <w:sz w:val="24"/>
+          <w:szCs w:val="24"/>
+        </w:rPr>
+        <w:t xml:space="preserve">CNN model performance is largely dictated by creating and training on </w:t>
+      </w:r>
+      <w:proofErr w:type="gramStart"/>
+      <w:r>
+        <w:rPr>
+          <w:sz w:val="24"/>
+          <w:szCs w:val="24"/>
+        </w:rPr>
+        <w:t>large labeled</w:t>
+      </w:r>
+      <w:proofErr w:type="gramEnd"/>
+      <w:r>
+        <w:rPr>
+          <w:sz w:val="24"/>
+          <w:szCs w:val="24"/>
+        </w:rPr>
+        <w:t xml:space="preserve"> datasets. Although few studies have tried to estimate expected model performance based on the number of images in each class of a dataset (Cho et al. 2016; Shahinfar et al. 2020), the </w:t>
+      </w:r>
+      <w:proofErr w:type="gramStart"/>
+      <w:r>
+        <w:rPr>
+          <w:sz w:val="24"/>
+          <w:szCs w:val="24"/>
+        </w:rPr>
+        <w:t>general consensus</w:t>
+      </w:r>
+      <w:proofErr w:type="gramEnd"/>
+      <w:r>
+        <w:rPr>
+          <w:sz w:val="24"/>
+          <w:szCs w:val="24"/>
+        </w:rPr>
+        <w:t xml:space="preserve"> is that more data are always better. We created a database of chum salmon scale images of all age classes that spans most of the </w:t>
+      </w:r>
+      <w:r>
+        <w:rPr>
+          <w:sz w:val="24"/>
+          <w:szCs w:val="24"/>
+          <w:highlight w:val="white"/>
+        </w:rPr>
+        <w:t>Pacific Northwest and Alaska</w:t>
+      </w:r>
+      <w:r>
+        <w:rPr>
+          <w:sz w:val="24"/>
+          <w:szCs w:val="24"/>
+        </w:rPr>
+        <w:t xml:space="preserve">. Despite efforts to balance representation of all chum salmon ages, extensive age class imbalance exists in the dataset. This class imbalance led to poor model performance when estimating age of under-represented age classes (ages 2 and 6), except for age-1 fish. </w:t>
+      </w:r>
+      <w:r>
+        <w:rPr>
+          <w:sz w:val="24"/>
+          <w:szCs w:val="24"/>
+          <w:highlight w:val="white"/>
+        </w:rPr>
+        <w:t xml:space="preserve">The simplicity of the growth pattern in age-1 fish, wide-spaced summer </w:t>
+      </w:r>
+      <w:proofErr w:type="spellStart"/>
+      <w:r>
+        <w:rPr>
+          <w:sz w:val="24"/>
+          <w:szCs w:val="24"/>
+          <w:highlight w:val="white"/>
+        </w:rPr>
+        <w:t>circuli</w:t>
+      </w:r>
+      <w:proofErr w:type="spellEnd"/>
+      <w:r>
+        <w:rPr>
+          <w:sz w:val="24"/>
+          <w:szCs w:val="24"/>
+          <w:highlight w:val="white"/>
+        </w:rPr>
+        <w:t xml:space="preserve"> and only one compression event (winter) near the outer margin of the scale, was likely easily distinguished by the model (Figure S2). </w:t>
+      </w:r>
+      <w:r>
+        <w:rPr>
+          <w:sz w:val="24"/>
+          <w:szCs w:val="24"/>
+        </w:rPr>
+        <w:t xml:space="preserve">Under-represented age classes were encountered infrequently enough (less than 1% of our total dataset) that their </w:t>
+      </w:r>
+      <w:proofErr w:type="spellStart"/>
+      <w:r>
+        <w:rPr>
+          <w:sz w:val="24"/>
+          <w:szCs w:val="24"/>
+        </w:rPr>
+        <w:t>miscategorization</w:t>
+      </w:r>
+      <w:proofErr w:type="spellEnd"/>
+      <w:r>
+        <w:rPr>
+          <w:sz w:val="24"/>
+          <w:szCs w:val="24"/>
+        </w:rPr>
+        <w:t xml:space="preserve"> by the DL models may be acceptable in management. Improved performance is expected as additional images become available for these age classes and models are updated.</w:t>
+      </w:r>
+    </w:p>
+    <w:p>
+      <w:pPr>
+        <w:spacing w:line="480" w:lineRule="auto"/>
+        <w:jc w:val="left"/>
+        <w:rPr>
+          <w:sz w:val="24"/>
+          <w:szCs w:val="24"/>
+        </w:rPr>
+      </w:pPr>
+      <w:r>
+        <w:rPr>
+          <w:sz w:val="24"/>
+          <w:szCs w:val="24"/>
+        </w:rPr>
+        <w:t xml:space="preserve">The quality of scale images varied by agency due to differences in image capture technology as well as differences in fish condition when scales were collected. Salmon caught at sea in trawl nets were typically in poorer shape than those collected in nearshore fisheries. This is because </w:t>
       </w:r>
       <w:r>
         <w:rPr>
@@ -3114,24 +3396,7 @@
           <w:szCs w:val="24"/>
         </w:rPr>
         <w:lastRenderedPageBreak/>
-        <w:t>throughput and meet the rising demand for age data within limited time windows, as well as providing automated sample validation or an additional layer of QA/QC.</w:t>
-      </w:r>
-    </w:p>
-    <w:p>
-      <w:pPr>
-        <w:spacing w:line="480" w:lineRule="auto"/>
-        <w:jc w:val="left"/>
-        <w:rPr>
-          <w:sz w:val="24"/>
-          <w:szCs w:val="24"/>
-        </w:rPr>
-      </w:pPr>
-      <w:r>
-        <w:rPr>
-          <w:sz w:val="24"/>
-          <w:szCs w:val="24"/>
-        </w:rPr>
-        <w:t xml:space="preserve">CNN model performance is largely dictated by creating and training on </w:t>
+        <w:t xml:space="preserve">scales from the preferred zones on the fish’s body are usually lost during capture in trawl fisheries. The use of the Laplacian score to filter out lower quality images from the NOAA collection was important for developing models. The combination of poorer scale conditions at time of sampling with use of the older technology to capture </w:t>
       </w:r>
       <w:proofErr w:type="gramStart"/>
       <w:r>
@@ -3139,7 +3404,7 @@
           <w:sz w:val="24"/>
           <w:szCs w:val="24"/>
         </w:rPr>
-        <w:t>large labeled</w:t>
+        <w:t>images,</w:t>
       </w:r>
       <w:proofErr w:type="gramEnd"/>
       <w:r>
@@ -3147,128 +3412,7 @@
           <w:sz w:val="24"/>
           <w:szCs w:val="24"/>
         </w:rPr>
-        <w:t xml:space="preserve"> datasets. Although few studies have tried to estimate expected model performance based on the number of images in each class of a dataset (Cho et al. 2016; Shahinfar et al. 2020), the </w:t>
-      </w:r>
-      <w:proofErr w:type="gramStart"/>
-      <w:r>
-        <w:rPr>
-          <w:sz w:val="24"/>
-          <w:szCs w:val="24"/>
-        </w:rPr>
-        <w:t>general consensus</w:t>
-      </w:r>
-      <w:proofErr w:type="gramEnd"/>
-      <w:r>
-        <w:rPr>
-          <w:sz w:val="24"/>
-          <w:szCs w:val="24"/>
-        </w:rPr>
-        <w:t xml:space="preserve"> is that more data are always better. We created a database of chum salmon scale images of all age classes that spans most of the </w:t>
-      </w:r>
-      <w:r>
-        <w:rPr>
-          <w:sz w:val="24"/>
-          <w:szCs w:val="24"/>
-          <w:highlight w:val="white"/>
-        </w:rPr>
-        <w:t>Pacific Northwest and Alaska</w:t>
-      </w:r>
-      <w:r>
-        <w:rPr>
-          <w:sz w:val="24"/>
-          <w:szCs w:val="24"/>
-        </w:rPr>
-        <w:t xml:space="preserve">. Despite efforts to balance representation of all chum salmon ages, extensive age class imbalance exists in the dataset. This class imbalance led to poor model performance when estimating age of under-represented age classes (ages 2 and 6), except for age-1 fish. </w:t>
-      </w:r>
-      <w:r>
-        <w:rPr>
-          <w:sz w:val="24"/>
-          <w:szCs w:val="24"/>
-          <w:highlight w:val="white"/>
-        </w:rPr>
-        <w:t xml:space="preserve">The simplicity of the growth pattern in age-1 fish, wide-spaced summer </w:t>
-      </w:r>
-      <w:proofErr w:type="spellStart"/>
-      <w:r>
-        <w:rPr>
-          <w:sz w:val="24"/>
-          <w:szCs w:val="24"/>
-          <w:highlight w:val="white"/>
-        </w:rPr>
-        <w:t>circuli</w:t>
-      </w:r>
-      <w:proofErr w:type="spellEnd"/>
-      <w:r>
-        <w:rPr>
-          <w:sz w:val="24"/>
-          <w:szCs w:val="24"/>
-          <w:highlight w:val="white"/>
-        </w:rPr>
-        <w:t xml:space="preserve"> and only one compression event (winter) near the outer margin of the scale, was likely easily distinguished by the model (Figure S2). </w:t>
-      </w:r>
-      <w:r>
-        <w:rPr>
-          <w:sz w:val="24"/>
-          <w:szCs w:val="24"/>
-        </w:rPr>
-        <w:t xml:space="preserve">Under-represented age classes were encountered infrequently enough (less than 1% of our total dataset) that their </w:t>
-      </w:r>
-      <w:proofErr w:type="spellStart"/>
-      <w:r>
-        <w:rPr>
-          <w:sz w:val="24"/>
-          <w:szCs w:val="24"/>
-        </w:rPr>
-        <w:t>miscategorization</w:t>
-      </w:r>
-      <w:proofErr w:type="spellEnd"/>
-      <w:r>
-        <w:rPr>
-          <w:sz w:val="24"/>
-          <w:szCs w:val="24"/>
-        </w:rPr>
-        <w:t xml:space="preserve"> by the DL models may be acceptable in management. Improved performance is expected as additional images become available for these age classes and models are updated.</w:t>
-      </w:r>
-    </w:p>
-    <w:p>
-      <w:pPr>
-        <w:spacing w:line="480" w:lineRule="auto"/>
-        <w:jc w:val="left"/>
-        <w:rPr>
-          <w:sz w:val="24"/>
-          <w:szCs w:val="24"/>
-        </w:rPr>
-      </w:pPr>
-      <w:r>
-        <w:rPr>
-          <w:sz w:val="24"/>
-          <w:szCs w:val="24"/>
-        </w:rPr>
-        <w:t xml:space="preserve">The quality of scale images varied by agency due to differences in image capture technology as well as differences in fish condition when scales were collected. Salmon caught at sea in trawl nets were typically in poorer shape than those collected in nearshore fisheries. This is because scales from the preferred zones on the fish’s body are usually lost during capture in trawl fisheries. The use of the Laplacian score to filter out lower quality images from the NOAA collection was important for developing models. The combination of poorer scale conditions at time of sampling with use of the older technology to capture </w:t>
-      </w:r>
-      <w:proofErr w:type="gramStart"/>
-      <w:r>
-        <w:rPr>
-          <w:sz w:val="24"/>
-          <w:szCs w:val="24"/>
-        </w:rPr>
-        <w:t>images,</w:t>
-      </w:r>
-      <w:proofErr w:type="gramEnd"/>
-      <w:r>
-        <w:rPr>
-          <w:sz w:val="24"/>
-          <w:szCs w:val="24"/>
-        </w:rPr>
-        <w:t xml:space="preserve"> may explain the marginally lower age inference performance for the NOAA collections. One benefit of heterogeneity in </w:t>
-      </w:r>
-      <w:r>
-        <w:rPr>
-          <w:sz w:val="24"/>
-          <w:szCs w:val="24"/>
-        </w:rPr>
-        <w:lastRenderedPageBreak/>
-        <w:t xml:space="preserve">image quality and image capture protocols within the training dataset is that it will likely aid in the generalization of these models to other projects with similar constraints; however, filtering of very poor images may be required before generating age estimates. </w:t>
+        <w:t xml:space="preserve"> may explain the marginally lower age inference performance for the NOAA collections. One benefit of heterogeneity in image quality and image capture protocols within the training dataset is that it will likely aid in the generalization of these models to other projects with similar constraints; however, filtering of very poor images may be required before generating age estimates. </w:t>
       </w:r>
     </w:p>
     <w:p>
@@ -3369,6 +3513,7 @@
           <w:sz w:val="24"/>
           <w:szCs w:val="24"/>
         </w:rPr>
+        <w:lastRenderedPageBreak/>
         <w:t>Preprocessing steps that remove background noise in the image around the scale increased model performance. The SAM, which removed the background surrounding the scale, performed better than the YOLO model that produced square-cropped output but retained background noise around the scale. However, the SAM process in extremely rare instances either cropped out the entire scale or excluded a sliver of the scale edge that can be important for manual scale age estimation, particularly for scales exhibiting complex patterns (</w:t>
       </w:r>
       <w:r>
@@ -3385,137 +3530,130 @@
           <w:sz w:val="24"/>
           <w:szCs w:val="24"/>
         </w:rPr>
-        <w:t xml:space="preserve"> Chinook salmon scales with </w:t>
-      </w:r>
-      <w:r>
-        <w:rPr>
-          <w:sz w:val="24"/>
-          <w:szCs w:val="24"/>
+        <w:t xml:space="preserve"> Chinook salmon scales with resorption; MacLellan and Gillespie 2015). YOLO preprocessing, with only marginally lower performance than SAM, may be preferable in those cases. </w:t>
+      </w:r>
+    </w:p>
+    <w:p>
+      <w:pPr>
+        <w:spacing w:before="240" w:after="240" w:line="480" w:lineRule="auto"/>
+        <w:jc w:val="left"/>
+        <w:rPr>
+          <w:sz w:val="24"/>
+          <w:szCs w:val="24"/>
+        </w:rPr>
+      </w:pPr>
+      <w:r>
+        <w:rPr>
+          <w:sz w:val="24"/>
+          <w:szCs w:val="24"/>
+        </w:rPr>
+        <w:t xml:space="preserve">Manual age estimation requires a degree of subjectivity </w:t>
+      </w:r>
+      <w:r>
+        <w:rPr>
+          <w:sz w:val="24"/>
+          <w:szCs w:val="24"/>
+          <w:highlight w:val="white"/>
+        </w:rPr>
+        <w:t xml:space="preserve">(Boehlert 1985) that is </w:t>
+      </w:r>
+      <w:r>
+        <w:rPr>
+          <w:sz w:val="24"/>
+          <w:szCs w:val="24"/>
+        </w:rPr>
+        <w:t>largely influenced by the complexity of the growth pattern (McNicol and MacLellan 2010; Harris 2020) or by the scale condition</w:t>
+      </w:r>
+      <w:r>
+        <w:rPr>
+          <w:sz w:val="24"/>
+          <w:szCs w:val="24"/>
+          <w:highlight w:val="white"/>
+        </w:rPr>
+        <w:t xml:space="preserve">. Interpreting scale </w:t>
+      </w:r>
+      <w:proofErr w:type="gramStart"/>
+      <w:r>
+        <w:rPr>
+          <w:sz w:val="24"/>
+          <w:szCs w:val="24"/>
+          <w:highlight w:val="white"/>
+        </w:rPr>
+        <w:t>condition</w:t>
+      </w:r>
+      <w:proofErr w:type="gramEnd"/>
+      <w:r>
+        <w:rPr>
+          <w:sz w:val="24"/>
+          <w:szCs w:val="24"/>
+          <w:highlight w:val="white"/>
+        </w:rPr>
+        <w:t xml:space="preserve">(s) is fundamental in the age assignment process. Checks, regeneration, and resorption (Figure S4) are biological features of fish growth that disrupt growth patterns and can be misinterpreted, generating error in the age estimate. </w:t>
+      </w:r>
+      <w:r>
+        <w:rPr>
+          <w:sz w:val="24"/>
+          <w:szCs w:val="24"/>
+        </w:rPr>
+        <w:t xml:space="preserve">A good example of subjectivity due to the complexity of the growth pattern are checks or false annuli. Checks are nonannual growth that result from unusual growth possibly created by changing temperature, prey fluctuations, spawning, and physiological stress to list a few (Clutter and Whitesel 1956; Meekan et al. 1999; Schneider et al. 2000). A prominent check can be confused with an annulus because they are similar in appearance and may result in </w:t>
+      </w:r>
+      <w:proofErr w:type="gramStart"/>
+      <w:r>
+        <w:rPr>
+          <w:sz w:val="24"/>
+          <w:szCs w:val="24"/>
+        </w:rPr>
+        <w:t>the</w:t>
+      </w:r>
+      <w:proofErr w:type="gramEnd"/>
+      <w:r>
+        <w:rPr>
+          <w:sz w:val="24"/>
+          <w:szCs w:val="24"/>
+        </w:rPr>
+        <w:t xml:space="preserve"> overestimation of age for that fish. Misinterpretation of scale growth patterns </w:t>
+      </w:r>
+      <w:r>
+        <w:rPr>
+          <w:sz w:val="24"/>
+          <w:szCs w:val="24"/>
+          <w:highlight w:val="white"/>
+        </w:rPr>
+        <w:t>affects the repeatability of age estimates within and among age readers, making it</w:t>
+      </w:r>
+      <w:r>
+        <w:rPr>
+          <w:sz w:val="24"/>
+          <w:szCs w:val="24"/>
+        </w:rPr>
+        <w:t xml:space="preserve"> difficult to achieve consistent age assignments even when viewing the same structure. In this study, among the 260 cases in the test dataset where the ensemble differed from the original label, 75 (28.8%) were classified as ambiguous, with the reviewers disagreeing on the total age of the scales.</w:t>
+      </w:r>
+      <w:r>
+        <w:rPr>
+          <w:sz w:val="24"/>
+          <w:szCs w:val="24"/>
+          <w:highlight w:val="white"/>
+        </w:rPr>
+        <w:t xml:space="preserve"> </w:t>
+      </w:r>
+    </w:p>
+    <w:p>
+      <w:pPr>
+        <w:spacing w:before="240" w:after="240" w:line="480" w:lineRule="auto"/>
+        <w:jc w:val="left"/>
+        <w:rPr>
+          <w:sz w:val="24"/>
+          <w:szCs w:val="24"/>
+          <w:highlight w:val="white"/>
+        </w:rPr>
+      </w:pPr>
+      <w:r>
+        <w:rPr>
+          <w:sz w:val="24"/>
+          <w:szCs w:val="24"/>
+          <w:highlight w:val="white"/>
         </w:rPr>
         <w:lastRenderedPageBreak/>
-        <w:t xml:space="preserve">resorption; MacLellan and Gillespie 2015). YOLO preprocessing, with only marginally lower performance than SAM, may be preferable in those cases. </w:t>
-      </w:r>
-    </w:p>
-    <w:p>
-      <w:pPr>
-        <w:spacing w:before="240" w:after="240" w:line="480" w:lineRule="auto"/>
-        <w:jc w:val="left"/>
-        <w:rPr>
-          <w:sz w:val="24"/>
-          <w:szCs w:val="24"/>
-        </w:rPr>
-      </w:pPr>
-      <w:r>
-        <w:rPr>
-          <w:sz w:val="24"/>
-          <w:szCs w:val="24"/>
-        </w:rPr>
-        <w:t xml:space="preserve">Manual age estimation requires a degree of subjectivity </w:t>
-      </w:r>
-      <w:r>
-        <w:rPr>
-          <w:sz w:val="24"/>
-          <w:szCs w:val="24"/>
-          <w:highlight w:val="white"/>
-        </w:rPr>
-        <w:t xml:space="preserve">(Boehlert 1985) that is </w:t>
-      </w:r>
-      <w:r>
-        <w:rPr>
-          <w:sz w:val="24"/>
-          <w:szCs w:val="24"/>
-        </w:rPr>
-        <w:t>largely influenced by the complexity of the growth pattern (McNicol and MacLellan 2010; Harris 2020) or by the scale condition</w:t>
-      </w:r>
-      <w:r>
-        <w:rPr>
-          <w:sz w:val="24"/>
-          <w:szCs w:val="24"/>
-          <w:highlight w:val="white"/>
-        </w:rPr>
-        <w:t xml:space="preserve">. Interpreting scale </w:t>
-      </w:r>
-      <w:proofErr w:type="gramStart"/>
-      <w:r>
-        <w:rPr>
-          <w:sz w:val="24"/>
-          <w:szCs w:val="24"/>
-          <w:highlight w:val="white"/>
-        </w:rPr>
-        <w:t>condition</w:t>
-      </w:r>
-      <w:proofErr w:type="gramEnd"/>
-      <w:r>
-        <w:rPr>
-          <w:sz w:val="24"/>
-          <w:szCs w:val="24"/>
-          <w:highlight w:val="white"/>
-        </w:rPr>
-        <w:t xml:space="preserve">(s) is fundamental in the age assignment process. Checks, regeneration, and resorption (Figure S4) are biological features of fish growth that disrupt growth patterns and can be misinterpreted, generating error in the age estimate. </w:t>
-      </w:r>
-      <w:r>
-        <w:rPr>
-          <w:sz w:val="24"/>
-          <w:szCs w:val="24"/>
-        </w:rPr>
-        <w:t xml:space="preserve">A good example of subjectivity due to the complexity of the growth pattern are checks or false annuli. Checks are nonannual growth that result from unusual growth possibly created by changing temperature, prey fluctuations, spawning, and physiological stress to list a few (Clutter and Whitesel 1956; Meekan et al. 1999; Schneider et al. 2000). A prominent check can be confused with an annulus because they are similar in appearance and may result in </w:t>
-      </w:r>
-      <w:proofErr w:type="gramStart"/>
-      <w:r>
-        <w:rPr>
-          <w:sz w:val="24"/>
-          <w:szCs w:val="24"/>
-        </w:rPr>
-        <w:t>the</w:t>
-      </w:r>
-      <w:proofErr w:type="gramEnd"/>
-      <w:r>
-        <w:rPr>
-          <w:sz w:val="24"/>
-          <w:szCs w:val="24"/>
-        </w:rPr>
-        <w:t xml:space="preserve"> overestimation of age for that fish. Misinterpretation of scale growth patterns </w:t>
-      </w:r>
-      <w:r>
-        <w:rPr>
-          <w:sz w:val="24"/>
-          <w:szCs w:val="24"/>
-          <w:highlight w:val="white"/>
-        </w:rPr>
-        <w:t>affects the repeatability of age estimates within and among age readers, making it</w:t>
-      </w:r>
-      <w:r>
-        <w:rPr>
-          <w:sz w:val="24"/>
-          <w:szCs w:val="24"/>
-        </w:rPr>
-        <w:t xml:space="preserve"> difficult to achieve consistent age assignments even when viewing the same structure. In this study, among the 260 cases in the test dataset where the ensemble differed from the original label, 75 (28.8%) were classified as ambiguous, with the reviewers disagreeing on the total age of the scales.</w:t>
-      </w:r>
-      <w:r>
-        <w:rPr>
-          <w:sz w:val="24"/>
-          <w:szCs w:val="24"/>
-          <w:highlight w:val="white"/>
-        </w:rPr>
-        <w:t xml:space="preserve"> </w:t>
-      </w:r>
-    </w:p>
-    <w:p>
-      <w:pPr>
-        <w:spacing w:before="240" w:after="240" w:line="480" w:lineRule="auto"/>
-        <w:jc w:val="left"/>
-        <w:rPr>
-          <w:sz w:val="24"/>
-          <w:szCs w:val="24"/>
-          <w:highlight w:val="white"/>
-        </w:rPr>
-      </w:pPr>
-      <w:r>
-        <w:rPr>
-          <w:sz w:val="24"/>
-          <w:szCs w:val="24"/>
-          <w:highlight w:val="white"/>
-        </w:rPr>
         <w:t xml:space="preserve">Ambiguous scale patterns were one of the main contributors to discrepancy between model output and image labels. To deal with subjectivity in age estimates, </w:t>
       </w:r>
       <w:r>
@@ -3531,16 +3669,7 @@
           <w:szCs w:val="24"/>
           <w:highlight w:val="white"/>
         </w:rPr>
-        <w:t xml:space="preserve"> Ideally, predictive algorithms should be trained on the highest quality age data (Morison et al. 1998) and specimens of known age (Yole 1989). This, however, is </w:t>
-      </w:r>
-      <w:r>
-        <w:rPr>
-          <w:sz w:val="24"/>
-          <w:szCs w:val="24"/>
-          <w:highlight w:val="white"/>
-        </w:rPr>
-        <w:lastRenderedPageBreak/>
-        <w:t xml:space="preserve">difficult to achieve. Because these models are trained using expert derived ages, they may also learn biases that are shared among readers or agencies. This study included known age otolith and scale pairs from NSRAA, but they comprised a small fraction (&lt;4%) of the dataset. Known-age samples are difficult to come by because validation and tagging studies are expensive, often producing limited returns of known-age fish. In the absence of known age samples, any predictive age algorithm used in management must be trained on high-quality scale images that represent scale conditions typically encountered as well as those that were previously aged and vetted by experienced readers across agencies with high precision and clear protocols. </w:t>
+        <w:t xml:space="preserve"> Ideally, predictive algorithms should be trained on the highest quality age data (Morison et al. 1998) and specimens of known age (Yole 1989). This, however, is difficult to achieve. Because these models are trained using expert derived ages, they may also learn biases that are shared among readers or agencies. This study included known age otolith and scale pairs from NSRAA, but they comprised a small fraction (&lt;4%) of the dataset. Known-age samples are difficult to come by because validation and tagging studies are expensive, often producing limited returns of known-age fish. In the absence of known age samples, any predictive age algorithm used in management must be trained on high-quality scale images that represent scale conditions typically encountered as well as those that were previously aged and vetted by experienced readers across agencies with high precision and clear protocols. </w:t>
       </w:r>
     </w:p>
     <w:p>
@@ -3629,7 +3758,7 @@
           <w:szCs w:val="24"/>
           <w:highlight w:val="white"/>
         </w:rPr>
-        <w:t xml:space="preserve">, model weights and all layers are fixed) and will produce the same prediction for the same scale image, unless the model is retrained. This may provide managers and decision makers some assurance that even though the models' inference process is opaque, its predictions are consistent and do not experience drift that occurs when a scale pattern is interpreted differently over time. If the model performance of the CNNs declines over time in the absence of updated training, it could be indicative of systemic changes in the target populations as could possibly occur in the context of environmental change. This insight into how environmental change affects fish growth and </w:t>
+        <w:t xml:space="preserve">, model weights and all layers are fixed) and will produce the same prediction for the same scale image, unless the </w:t>
       </w:r>
       <w:r>
         <w:rPr>
@@ -3638,7 +3767,7 @@
           <w:highlight w:val="white"/>
         </w:rPr>
         <w:lastRenderedPageBreak/>
-        <w:t xml:space="preserve">demographics would be useful to management. Despite the advantages, </w:t>
+        <w:t xml:space="preserve">model is retrained. This may provide managers and decision makers some assurance that even though the models' inference process is opaque, its predictions are consistent and do not experience drift that occurs when a scale pattern is interpreted differently over time. If the model performance of the CNNs declines over time in the absence of updated training, it could be indicative of systemic changes in the target populations as could possibly occur in the context of environmental change. This insight into how environmental change affects fish growth and demographics would be useful to management. Despite the advantages, </w:t>
       </w:r>
       <w:r>
         <w:rPr>
@@ -3706,7 +3835,15 @@
           <w:sz w:val="24"/>
           <w:szCs w:val="24"/>
         </w:rPr>
-        <w:t xml:space="preserve"> These measures could include an independent or unbiased review of 10-20% of the samples, along with other rigorous, ongoing evaluations to ensure predictions remain reliable over time. Such evaluations may include scheduled model retraining to account for changing environmental conditions. While not directly addressed in this study, changing environmental conditions </w:t>
+        <w:t xml:space="preserve"> These measures could include an independent or unbiased review of 10-20% of the samples, along with other rigorous, ongoing evaluations to </w:t>
+      </w:r>
+      <w:r>
+        <w:rPr>
+          <w:sz w:val="24"/>
+          <w:szCs w:val="24"/>
+        </w:rPr>
+        <w:lastRenderedPageBreak/>
+        <w:t xml:space="preserve">ensure predictions remain reliable over time. Such evaluations may include scheduled model retraining to account for changing environmental conditions. While not directly addressed in this study, changing environmental conditions </w:t>
       </w:r>
       <w:proofErr w:type="gramStart"/>
       <w:r>
@@ -3739,15 +3876,7 @@
           <w:sz w:val="24"/>
           <w:szCs w:val="24"/>
         </w:rPr>
-        <w:t xml:space="preserve">Age data are integral to chum salmon management and are used in run reconstruction models (Fleischman and Borba 2009), sibship models for forecasting abundance (Haeseker et al. 2007), </w:t>
-      </w:r>
-      <w:r>
-        <w:rPr>
-          <w:sz w:val="24"/>
-          <w:szCs w:val="24"/>
-        </w:rPr>
-        <w:lastRenderedPageBreak/>
-        <w:t xml:space="preserve">and impact rate assessments of trawl bycatch (Haapala and </w:t>
+        <w:t xml:space="preserve">Age data are integral to chum salmon management and are used in run reconstruction models (Fleischman and Borba 2009), sibship models for forecasting abundance (Haeseker et al. 2007), and impact rate assessments of trawl bycatch (Haapala and </w:t>
       </w:r>
       <w:proofErr w:type="spellStart"/>
       <w:r>
@@ -3846,7 +3975,16 @@
           <w:szCs w:val="24"/>
           <w:highlight w:val="white"/>
         </w:rPr>
-        <w:t xml:space="preserve">Efficiencies gained through the implementation of modeled age prediction will inevitably shift the primary bottleneck from human‑generated age estimates to the laboratory’s capacity to image scales </w:t>
+        <w:t xml:space="preserve">Efficiencies gained through the implementation of modeled age prediction will inevitably shift the primary bottleneck from human‑generated age estimates to the laboratory’s capacity to image </w:t>
+      </w:r>
+      <w:r>
+        <w:rPr>
+          <w:sz w:val="24"/>
+          <w:szCs w:val="24"/>
+          <w:highlight w:val="white"/>
+        </w:rPr>
+        <w:lastRenderedPageBreak/>
+        <w:t xml:space="preserve">scales </w:t>
       </w:r>
       <w:proofErr w:type="spellStart"/>
       <w:r>
@@ -3882,16 +4020,7 @@
           <w:szCs w:val="24"/>
           <w:highlight w:val="white"/>
         </w:rPr>
-        <w:t xml:space="preserve"> high agreement with trained ageing personnel, and future efforts should focus on establishing an efficient, high‑throughput workflow encompassing image capture, image selection, data management, age prediction, and model performance evaluation. We envision two complementary streams of image acquisition. The first leverages existing ageing stations equipped with integrated camera microscopes, where chum salmon scales are routinely aged on a high‑resolution monitor and imaged as required. Under this workflow, a predetermined subset of scales within each scale </w:t>
-      </w:r>
-      <w:r>
-        <w:rPr>
-          <w:sz w:val="24"/>
-          <w:szCs w:val="24"/>
-          <w:highlight w:val="white"/>
-        </w:rPr>
-        <w:lastRenderedPageBreak/>
-        <w:t xml:space="preserve">book can continue to be manually aged, while the remaining scales will be imaged for predictive age assignment. This approach reduces handling time and enables </w:t>
+        <w:t xml:space="preserve"> high agreement with trained ageing personnel, and future efforts should focus on establishing an efficient, high‑throughput workflow encompassing image capture, image selection, data management, age prediction, and model performance evaluation. We envision two complementary streams of image acquisition. The first leverages existing ageing stations equipped with integrated camera microscopes, where chum salmon scales are routinely aged on a high‑resolution monitor and imaged as required. Under this workflow, a predetermined subset of scales within each scale book can continue to be manually aged, while the remaining scales will be imaged for predictive age assignment. This approach reduces handling time and enables </w:t>
       </w:r>
       <w:r>
         <w:rPr>
@@ -3953,7 +4082,7 @@
           <w:sz w:val="24"/>
           <w:szCs w:val="24"/>
         </w:rPr>
-        <w:t xml:space="preserve"> the stock composition of fishery catch mixtures (Patton et al. 1998) but has gradually been replaced with genetic stock identification methods. Using scale patterns to estimate fish origin (wild or hatchery produced), may simplify the tracking of wild and hatchery catch as opposed to analyzing thermally marked otoliths which require nontrivial effort to extract and prepare and whose application varies by region and species. Vabø et al. (2021) demonstrated high agreement to estimate the origin of Atlantic salmon, and our current scale image database includes wild and hatchery chum salmon from Southeast Alaska. Additional collections from Japan, Canada, and Russia, where substantial hatchery production occurs, may help train a model to infer origin for samples originating across the Pacific Rim. </w:t>
+        <w:t xml:space="preserve"> the stock composition of fishery catch mixtures (Patton et al. 1998) but has gradually been replaced with genetic stock identification methods. Using scale </w:t>
       </w:r>
       <w:r>
         <w:rPr>
@@ -3961,7 +4090,7 @@
           <w:szCs w:val="24"/>
         </w:rPr>
         <w:lastRenderedPageBreak/>
-        <w:t>Among wild-origin fish, the region or watershed of origin may provide differences in growth patterns that exist and are extractable by these models. These methods may help resolve stocks which are particularly difficult to identify using genetics alone. Additionally, providing a fast and automated means to measure scale growth from the focus to the end of the first marine zone would provide crucial data for forecasting adult abundance and survival patterns (Beamish and Mahnken 2001; Claiborne et al. 2020).</w:t>
+        <w:t>patterns to estimate fish origin (wild or hatchery produced), may simplify the tracking of wild and hatchery catch as opposed to analyzing thermally marked otoliths which require nontrivial effort to extract and prepare and whose application varies by region and species. Vabø et al. (2021) demonstrated high agreement to estimate the origin of Atlantic salmon, and our current scale image database includes wild and hatchery chum salmon from Southeast Alaska. Additional collections from Japan, Canada, and Russia, where substantial hatchery production occurs, may help train a model to infer origin for samples originating across the Pacific Rim. Among wild-origin fish, the region or watershed of origin may provide differences in growth patterns that exist and are extractable by these models. These methods may help resolve stocks which are particularly difficult to identify using genetics alone. Additionally, providing a fast and automated means to measure scale growth from the focus to the end of the first marine zone would provide crucial data for forecasting adult abundance and survival patterns (Beamish and Mahnken 2001; Claiborne et al. 2020).</w:t>
       </w:r>
     </w:p>
     <w:p>
@@ -4026,7 +4155,15 @@
           <w:sz w:val="24"/>
           <w:szCs w:val="24"/>
         </w:rPr>
-        <w:t xml:space="preserve"> age classes to the current scale database can improve estimation of these scales. With the rapid expansion of AI in fisheries and the continued acceleration in the field of DL, new, more sophisticated models can be trained using the same scale image archive. These models are freely available and can be easily integrated into projects where time and/or funding is limited, or where projects would benefit from an independent reader. The models should first be evaluated on validated scale samples before implementation. Although CNN models will never replace skilled personnel trained to interpret growth patterns from scales, they can improve capacity to produce fish age estimates. </w:t>
+        <w:t xml:space="preserve"> age classes to the current scale database can improve estimation of these scales. With the rapid expansion of AI in fisheries and the continued acceleration in the field of DL, new, more sophisticated models can </w:t>
+      </w:r>
+      <w:r>
+        <w:rPr>
+          <w:sz w:val="24"/>
+          <w:szCs w:val="24"/>
+        </w:rPr>
+        <w:lastRenderedPageBreak/>
+        <w:t xml:space="preserve">be trained using the same scale image archive. These models are freely available and can be easily integrated into projects where time and/or funding is limited, or where projects would benefit from an independent reader. The models should first be evaluated on validated scale samples before implementation. Although CNN models will never replace skilled personnel trained to interpret growth patterns from scales, they can improve capacity to produce fish age estimates. </w:t>
       </w:r>
     </w:p>
     <w:p>
@@ -4041,7 +4178,6 @@
         <w:rPr>
           <w:color w:val="000000"/>
         </w:rPr>
-        <w:lastRenderedPageBreak/>
         <w:t>Acknowledgements</w:t>
       </w:r>
     </w:p>
@@ -4140,6 +4276,7 @@
         <w:rPr>
           <w:color w:val="000000"/>
         </w:rPr>
+        <w:lastRenderedPageBreak/>
         <w:t xml:space="preserve">Competing </w:t>
       </w:r>
       <w:proofErr w:type="gramStart"/>
@@ -4246,7 +4383,6 @@
           <w:sz w:val="24"/>
           <w:szCs w:val="24"/>
         </w:rPr>
-        <w:lastRenderedPageBreak/>
         <w:t>JW, RA, PDB, MC, and NL conceptualized the study. RA, PDB, MC, NL, JN, SW, SG, TS, and BA curated the data. Formal analyses were conducted by RA, PDB, and MC. Funding was acquired by RA, PDB, MC, JN, and NL. The investigation was carried out by RA, MC, JN, SW, SG, TS, and PDB. Methodology was developed by RA, PDB, MC, JN, SW, and TS. Project administration was led by RA. Resources were provided by JN, SW, TS, PDB, RA, and MC. Software development was performed by RA, MC, and PDB. Supervision was provided by RA and MC. Visualization was completed by RA, PDB, and MC. The original draft was written by RA, PDB, MC, JN, and SW, with review and editing by RA, MC, PDB, JN, SW, JW, SG and EC.</w:t>
       </w:r>
     </w:p>
@@ -4332,6 +4468,7 @@
           <w:sz w:val="24"/>
           <w:szCs w:val="24"/>
         </w:rPr>
+        <w:lastRenderedPageBreak/>
         <w:t>North Pacific Marine Research Program Project SFOS 99-188.</w:t>
       </w:r>
     </w:p>
@@ -4427,7 +4564,6 @@
           <w:sz w:val="24"/>
           <w:szCs w:val="24"/>
         </w:rPr>
-        <w:lastRenderedPageBreak/>
         <w:t xml:space="preserve">Underlying data (scale images and trained model files) will be archived in a public repository (e.g., </w:t>
       </w:r>
       <w:proofErr w:type="spellStart"/>
@@ -4558,6 +4694,7 @@
           <w:sz w:val="24"/>
           <w:szCs w:val="24"/>
         </w:rPr>
+        <w:lastRenderedPageBreak/>
         <w:t xml:space="preserve">Agler, B.A., </w:t>
       </w:r>
       <w:proofErr w:type="spellStart"/>
@@ -4658,7 +4795,6 @@
           <w:sz w:val="24"/>
           <w:szCs w:val="24"/>
         </w:rPr>
-        <w:lastRenderedPageBreak/>
         <w:t xml:space="preserve">Barber, W.E., and Walker, R.J. 1988. </w:t>
       </w:r>
       <w:proofErr w:type="spellStart"/>
@@ -4820,7 +4956,15 @@
           <w:sz w:val="24"/>
           <w:szCs w:val="24"/>
         </w:rPr>
-        <w:t>Beamish, R.J., and McFarlane, G.A. 1995. A discussion of the importance of aging errors, and an application to walleye pollock: the world’s largest fishery. In Recent developments in fish otolith research. Edited by D.E. Secor, J.M. Dean, and S.E. Campana. University of South Carolina Press, Columbia, SC. pp. 545–565.</w:t>
+        <w:t xml:space="preserve">Beamish, R.J., and McFarlane, G.A. 1995. A discussion of the importance of aging errors, and an application to walleye pollock: the world’s largest fishery. In Recent </w:t>
+      </w:r>
+      <w:r>
+        <w:rPr>
+          <w:sz w:val="24"/>
+          <w:szCs w:val="24"/>
+        </w:rPr>
+        <w:lastRenderedPageBreak/>
+        <w:t>developments in fish otolith research. Edited by D.E. Secor, J.M. Dean, and S.E. Campana. University of South Carolina Press, Columbia, SC. pp. 545–565.</w:t>
       </w:r>
     </w:p>
     <w:p>
@@ -4872,7 +5016,6 @@
           <w:sz w:val="24"/>
           <w:szCs w:val="24"/>
         </w:rPr>
-        <w:lastRenderedPageBreak/>
         <w:t>Boehlert, G.W. 1985. Using objective criteria and multiple-regression models for age determination in fishes. Fish. Bull. U.S. 83: 103–117.</w:t>
       </w:r>
     </w:p>
@@ -4927,7 +5070,7 @@
         </w:rPr>
         <w:t>&gt;</w:t>
       </w:r>
-      <w:hyperlink r:id="rId8">
+      <w:hyperlink r:id="rId7">
         <w:r>
           <w:rPr>
             <w:color w:val="1155CC"/>
@@ -5029,6 +5172,7 @@
           <w:sz w:val="24"/>
           <w:szCs w:val="24"/>
         </w:rPr>
+        <w:lastRenderedPageBreak/>
         <w:t>Cho, J., Lee, K., Shin, E., Choy, G., and Do, S. 2016. How much data is needed to train a medical image deep learning system to achieve necessary high accuracy? arXiv:1511.06348. doi:10.48550/arXiv.1511.06348.</w:t>
       </w:r>
     </w:p>
@@ -5099,7 +5243,6 @@
           <w:sz w:val="24"/>
           <w:szCs w:val="24"/>
         </w:rPr>
-        <w:lastRenderedPageBreak/>
         <w:t xml:space="preserve">Claiborne, A.M., Campbell, L.A., Stevick, B.C., Sandell, T.A., Losee, J.P., Litz, M.N.C., and Anderson, J.J. 2020. Correspondence between scale growth, feeding conditions, and survival of adult Chinook salmon returning to the southern Salish Sea: implications for forecasting. Prog. </w:t>
       </w:r>
       <w:proofErr w:type="spellStart"/>
@@ -5248,6 +5391,7 @@
           <w:sz w:val="24"/>
           <w:szCs w:val="24"/>
         </w:rPr>
+        <w:lastRenderedPageBreak/>
         <w:t>Géron</w:t>
       </w:r>
       <w:proofErr w:type="spellEnd"/>
@@ -5340,15 +5484,7 @@
           <w:sz w:val="24"/>
           <w:szCs w:val="24"/>
         </w:rPr>
-        <w:t xml:space="preserve">, D. 2025. Draft environmental impact statement and regulatory impact review for a proposed amendment to the fishery management plan for </w:t>
-      </w:r>
-      <w:r>
-        <w:rPr>
-          <w:sz w:val="24"/>
-          <w:szCs w:val="24"/>
-        </w:rPr>
-        <w:lastRenderedPageBreak/>
-        <w:t>groundfish of the Bering Sea/Aleutian Islands management area—Bering Sea chum salmon bycatch management. North Pacific Fishery Management Council, Anchorage, AK.</w:t>
+        <w:t>, D. 2025. Draft environmental impact statement and regulatory impact review for a proposed amendment to the fishery management plan for groundfish of the Bering Sea/Aleutian Islands management area—Bering Sea chum salmon bycatch management. North Pacific Fishery Management Council, Anchorage, AK.</w:t>
       </w:r>
     </w:p>
     <w:p>
@@ -5384,7 +5520,7 @@
         </w:rPr>
         <w:t>(2): 634–642. doi:</w:t>
       </w:r>
-      <w:hyperlink r:id="rId9">
+      <w:hyperlink r:id="rId8">
         <w:r>
           <w:rPr>
             <w:color w:val="1155CC"/>
@@ -5505,6 +5641,7 @@
           <w:sz w:val="24"/>
           <w:szCs w:val="24"/>
         </w:rPr>
+        <w:lastRenderedPageBreak/>
         <w:t>Kimura, D.K., and Lyons, J.J. 1991. Between-reader bias and variability in the age-determination process. Fish. Bull. U.S. 89: 53–60.</w:t>
       </w:r>
     </w:p>
@@ -5557,15 +5694,7 @@
           <w:sz w:val="24"/>
           <w:szCs w:val="24"/>
         </w:rPr>
-        <w:t xml:space="preserve">Knudsen, E.E., Rand, P.S., Gorman, K.B., Bernard, D.R., and Templin, W.D. 2021. Hatchery-origin stray rates and total run characteristics for pink salmon and chum </w:t>
-      </w:r>
-      <w:r>
-        <w:rPr>
-          <w:sz w:val="24"/>
-          <w:szCs w:val="24"/>
-        </w:rPr>
-        <w:lastRenderedPageBreak/>
-        <w:t>salmon returning to Prince William Sound, Alaska, in 2013–2015. Mar. Coast. Fish. 13: 41–68. doi:10.1002/mcf2.10134</w:t>
+        <w:t>Knudsen, E.E., Rand, P.S., Gorman, K.B., Bernard, D.R., and Templin, W.D. 2021. Hatchery-origin stray rates and total run characteristics for pink salmon and chum salmon returning to Prince William Sound, Alaska, in 2013–2015. Mar. Coast. Fish. 13: 41–68. doi:10.1002/mcf2.10134</w:t>
       </w:r>
     </w:p>
     <w:p>
@@ -5737,6 +5866,7 @@
           <w:sz w:val="24"/>
           <w:szCs w:val="24"/>
         </w:rPr>
+        <w:lastRenderedPageBreak/>
         <w:t xml:space="preserve">Malde, K., Handegard, N.O., </w:t>
       </w:r>
       <w:proofErr w:type="spellStart"/>
@@ -5805,7 +5935,6 @@
           <w:sz w:val="24"/>
           <w:szCs w:val="24"/>
         </w:rPr>
-        <w:lastRenderedPageBreak/>
         <w:t>Meekan, M.G., Wellington, G.M., and Axe, L.M. 1999. El Niño–Southern Oscillation events produce checks in the otoliths of coral-reef fishes in the Galápagos Archipelago. Bull. Mar. Sci. 64: 383–390.</w:t>
       </w:r>
     </w:p>
@@ -5976,7 +6105,7 @@
         </w:rPr>
         <w:t>&gt;</w:t>
       </w:r>
-      <w:hyperlink r:id="rId10">
+      <w:hyperlink r:id="rId9">
         <w:r>
           <w:rPr>
             <w:color w:val="1155CC"/>
@@ -6010,6 +6139,7 @@
           <w:sz w:val="24"/>
           <w:szCs w:val="24"/>
         </w:rPr>
+        <w:lastRenderedPageBreak/>
         <w:t xml:space="preserve">Pech-Pacheco, J.L., Cristóbal, G., Chamorro-Martínez, J., and Fernández-Valdivia, J. 2000. Diatom autofocusing in brightfield microscopy: a comparative study. In Proc. 15th Int. Conf. Pattern </w:t>
       </w:r>
       <w:proofErr w:type="spellStart"/>
@@ -6126,7 +6256,6 @@
           <w:sz w:val="24"/>
           <w:szCs w:val="24"/>
         </w:rPr>
-        <w:lastRenderedPageBreak/>
         <w:t>Riedel, R., and Leaf, R.T. 2024. Assessing the utility of computer vision for age determination of Gulf menhaden. N. Am. J. Fish. Manag. 44: 1081–1091. doi:10.1002/nafm.11039.</w:t>
       </w:r>
     </w:p>
@@ -6231,7 +6360,15 @@
           <w:sz w:val="24"/>
           <w:szCs w:val="24"/>
         </w:rPr>
-        <w:t xml:space="preserve">Shahinfar, S., Meek, P., and Falzon, G. 2020. “How many images do I need?” Understanding how sample size per class affects deep learning model performance metrics for balanced designs in autonomous wildlife monitoring. Ecol. Inform. 57: 101085. </w:t>
+        <w:t xml:space="preserve">Shahinfar, S., Meek, P., and Falzon, G. 2020. “How many images do I need?” Understanding how sample size per class affects deep learning model performance </w:t>
+      </w:r>
+      <w:r>
+        <w:rPr>
+          <w:sz w:val="24"/>
+          <w:szCs w:val="24"/>
+        </w:rPr>
+        <w:lastRenderedPageBreak/>
+        <w:t xml:space="preserve">metrics for balanced designs in autonomous wildlife monitoring. Ecol. Inform. 57: 101085. </w:t>
       </w:r>
       <w:proofErr w:type="gramStart"/>
       <w:r>
@@ -6299,7 +6436,6 @@
           <w:sz w:val="24"/>
           <w:szCs w:val="24"/>
         </w:rPr>
-        <w:lastRenderedPageBreak/>
         <w:t xml:space="preserve">Suzuki, G., Nishiyama, M., </w:t>
       </w:r>
       <w:proofErr w:type="spellStart"/>
@@ -6519,6 +6655,7 @@
           <w:sz w:val="24"/>
           <w:szCs w:val="24"/>
         </w:rPr>
+        <w:lastRenderedPageBreak/>
         <w:t>Table 1</w:t>
       </w:r>
       <w:r>
@@ -6569,7 +6706,6 @@
       <w:bookmarkStart w:id="23" w:name="_g94w11z287x6" w:colFirst="0" w:colLast="0"/>
       <w:bookmarkEnd w:id="23"/>
       <w:r>
-        <w:lastRenderedPageBreak/>
         <w:t>Figures</w:t>
       </w:r>
     </w:p>
@@ -6716,6 +6852,7 @@
           <w:sz w:val="24"/>
           <w:szCs w:val="24"/>
         </w:rPr>
+        <w:lastRenderedPageBreak/>
         <w:t>Figure 4</w:t>
       </w:r>
       <w:r>
@@ -6763,7 +6900,6 @@
           <w:sz w:val="24"/>
           <w:szCs w:val="24"/>
         </w:rPr>
-        <w:lastRenderedPageBreak/>
         <w:t>Table A1</w:t>
       </w:r>
       <w:r>
@@ -6855,7 +6991,7 @@
       </w:r>
     </w:p>
     <w:sectPr>
-      <w:footerReference w:type="default" r:id="rId11"/>
+      <w:footerReference w:type="default" r:id="rId10"/>
       <w:pgSz w:w="12240" w:h="15840"/>
       <w:pgMar w:top="1440" w:right="1440" w:bottom="1440" w:left="1440" w:header="720" w:footer="720" w:gutter="0"/>
       <w:lnNumType w:countBy="1" w:restart="continuous"/>

</xml_diff>